<commit_message>
TP1 done i tihnk
</commit_message>
<xml_diff>
--- a/41TP Teorija pryjnattja rishen/1/TP_KNT-122_Onyshchenko_19_PR1.docx
+++ b/41TP Teorija pryjnattja rishen/1/TP_KNT-122_Onyshchenko_19_PR1.docx
@@ -113,15 +113,7 @@
       </w:pPr>
       <w:r>
         <w:rPr/>
-        <w:t>Дисципліна «</w:t>
-      </w:r>
-      <w:r>
-        <w:rPr/>
-        <w:t>Теорія прийняття рішень</w:t>
-      </w:r>
-      <w:r>
-        <w:rPr/>
-        <w:t>»</w:t>
+        <w:t>Дисципліна «Теорія прийняття рішень»</w:t>
       </w:r>
     </w:p>
     <w:p>
@@ -157,15 +149,7 @@
       </w:pPr>
       <w:r>
         <w:rPr/>
-        <w:t>Тема «</w:t>
-      </w:r>
-      <w:r>
-        <w:rPr/>
-        <w:t>Евристичний алгоритм класифікації з використанням даних навчального експерименту</w:t>
-      </w:r>
-      <w:r>
-        <w:rPr/>
-        <w:t>»</w:t>
+        <w:t>Тема «Евристичний алгоритм класифікації з використанням даних навчального експерименту»</w:t>
       </w:r>
     </w:p>
     <w:p>
@@ -336,30 +320,7 @@
         <w:tab/>
         <w:tab/>
         <w:tab/>
-      </w:r>
-      <w:r>
-        <w:rPr/>
-        <w:t>Дейнега</w:t>
-      </w:r>
-      <w:r>
-        <w:rPr/>
-        <w:t xml:space="preserve"> </w:t>
-      </w:r>
-      <w:r>
-        <w:rPr/>
-        <w:t>Л</w:t>
-      </w:r>
-      <w:r>
-        <w:rPr/>
-        <w:t>.</w:t>
-      </w:r>
-      <w:r>
-        <w:rPr/>
-        <w:t>Ю</w:t>
-      </w:r>
-      <w:r>
-        <w:rPr/>
-        <w:t>.</w:t>
+        <w:t>Дейнега Л.Ю.</w:t>
       </w:r>
     </w:p>
     <w:p>
@@ -449,6 +410,34 @@
         <w:rPr/>
         <w:t xml:space="preserve">Метою роботи є </w:t>
       </w:r>
+      <w:r>
+        <w:rPr>
+          <w:b w:val="false"/>
+          <w:i w:val="false"/>
+          <w:caps w:val="false"/>
+          <w:smallCaps w:val="false"/>
+          <w:spacing w:val="0"/>
+        </w:rPr>
+        <w:t xml:space="preserve">вивчити один із евристичних алгоритмів індивідуального прогнозування </w:t>
+      </w:r>
+      <w:r>
+        <w:rPr>
+          <w:caps w:val="false"/>
+          <w:smallCaps w:val="false"/>
+          <w:spacing w:val="0"/>
+        </w:rPr>
+        <w:t xml:space="preserve">– </w:t>
+      </w:r>
+      <w:r>
+        <w:rPr>
+          <w:b w:val="false"/>
+          <w:i w:val="false"/>
+          <w:caps w:val="false"/>
+          <w:smallCaps w:val="false"/>
+          <w:spacing w:val="0"/>
+        </w:rPr>
+        <w:t>класифікацію за однією ознакою з використанням даних навчального експерименту; навчитися обирати оптимальне порогове значення ознаки.</w:t>
+      </w:r>
     </w:p>
     <w:p>
       <w:pPr>
@@ -503,7 +492,7 @@
         <w:widowControl/>
         <w:numPr>
           <w:ilvl w:val="0"/>
-          <w:numId w:val="1"/>
+          <w:numId w:val="0"/>
         </w:numPr>
         <w:suppressAutoHyphens w:val="true"/>
         <w:bidi w:val="0"/>
@@ -514,11 +503,22 @@
       </w:pPr>
       <w:r>
         <w:rPr/>
+        <w:t>Використовуючи   конспект   лекцій   та   рекомендовану літературу,  вивчити  метод  класифікації  за  однією  ознакою  з використанням даних навчального експерименту. Ознайомитися зі змістом і порядком виконання роботи.</w:t>
       </w:r>
     </w:p>
     <w:p>
       <w:pPr>
         <w:pStyle w:val="p11"/>
+        <w:widowControl/>
+        <w:numPr>
+          <w:ilvl w:val="0"/>
+          <w:numId w:val="0"/>
+        </w:numPr>
+        <w:suppressAutoHyphens w:val="true"/>
+        <w:bidi w:val="0"/>
+        <w:spacing w:lineRule="auto" w:line="360" w:before="0" w:after="0"/>
+        <w:ind w:hanging="0" w:left="850" w:right="0"/>
+        <w:jc w:val="left"/>
         <w:rPr/>
       </w:pPr>
       <w:r>
@@ -547,6 +547,3873 @@
     </w:p>
     <w:p>
       <w:pPr>
+        <w:pStyle w:val="P1"/>
+        <w:rPr/>
+      </w:pPr>
+      <w:r>
+        <w:rPr/>
+      </w:r>
+    </w:p>
+    <w:p>
+      <w:pPr>
+        <w:pStyle w:val="Code"/>
+        <w:rPr>
+          <w:color w:val="auto"/>
+        </w:rPr>
+      </w:pPr>
+      <w:r>
+        <w:rPr>
+          <w:color w:val="auto"/>
+        </w:rPr>
+        <w:t>import pandas as pd</w:t>
+      </w:r>
+    </w:p>
+    <w:p>
+      <w:pPr>
+        <w:pStyle w:val="Code"/>
+        <w:rPr>
+          <w:color w:val="auto"/>
+        </w:rPr>
+      </w:pPr>
+      <w:r>
+        <w:rPr>
+          <w:color w:val="auto"/>
+        </w:rPr>
+        <w:t>import numpy as np</w:t>
+      </w:r>
+    </w:p>
+    <w:p>
+      <w:pPr>
+        <w:pStyle w:val="Code"/>
+        <w:rPr>
+          <w:color w:val="auto"/>
+        </w:rPr>
+      </w:pPr>
+      <w:r>
+        <w:rPr>
+          <w:color w:val="auto"/>
+        </w:rPr>
+        <w:t>import matplotlib.pyplot as plt</w:t>
+      </w:r>
+    </w:p>
+    <w:p>
+      <w:pPr>
+        <w:pStyle w:val="Code"/>
+        <w:rPr>
+          <w:color w:val="auto"/>
+        </w:rPr>
+      </w:pPr>
+      <w:r>
+        <w:rPr>
+          <w:color w:val="auto"/>
+        </w:rPr>
+      </w:r>
+    </w:p>
+    <w:p>
+      <w:pPr>
+        <w:pStyle w:val="Code"/>
+        <w:rPr>
+          <w:color w:val="auto"/>
+        </w:rPr>
+      </w:pPr>
+      <w:r>
+        <w:rPr>
+          <w:color w:val="auto"/>
+        </w:rPr>
+        <w:t># ==========================================</w:t>
+      </w:r>
+    </w:p>
+    <w:p>
+      <w:pPr>
+        <w:pStyle w:val="Code"/>
+        <w:rPr>
+          <w:color w:val="auto"/>
+        </w:rPr>
+      </w:pPr>
+      <w:r>
+        <w:rPr>
+          <w:color w:val="auto"/>
+        </w:rPr>
+        <w:t># 1. ВХІДНІ ДАНІ</w:t>
+      </w:r>
+    </w:p>
+    <w:p>
+      <w:pPr>
+        <w:pStyle w:val="Code"/>
+        <w:rPr>
+          <w:color w:val="auto"/>
+        </w:rPr>
+      </w:pPr>
+      <w:r>
+        <w:rPr>
+          <w:color w:val="auto"/>
+        </w:rPr>
+        <w:t># ==========================================</w:t>
+      </w:r>
+    </w:p>
+    <w:p>
+      <w:pPr>
+        <w:pStyle w:val="Code"/>
+        <w:rPr>
+          <w:color w:val="auto"/>
+        </w:rPr>
+      </w:pPr>
+      <w:r>
+        <w:rPr>
+          <w:color w:val="auto"/>
+        </w:rPr>
+        <w:t>VARIANT = 19</w:t>
+      </w:r>
+    </w:p>
+    <w:p>
+      <w:pPr>
+        <w:pStyle w:val="Code"/>
+        <w:rPr>
+          <w:color w:val="auto"/>
+        </w:rPr>
+      </w:pPr>
+      <w:r>
+        <w:rPr>
+          <w:color w:val="auto"/>
+        </w:rPr>
+      </w:r>
+    </w:p>
+    <w:p>
+      <w:pPr>
+        <w:pStyle w:val="Code"/>
+        <w:rPr>
+          <w:color w:val="auto"/>
+        </w:rPr>
+      </w:pPr>
+      <w:r>
+        <w:rPr>
+          <w:color w:val="auto"/>
+        </w:rPr>
+        <w:t># Дані з Таблиці 1 (U_sh - напруга шуму, alpha - коефіцієнт старіння)</w:t>
+      </w:r>
+    </w:p>
+    <w:p>
+      <w:pPr>
+        <w:pStyle w:val="Code"/>
+        <w:rPr>
+          <w:color w:val="auto"/>
+        </w:rPr>
+      </w:pPr>
+      <w:r>
+        <w:rPr>
+          <w:color w:val="auto"/>
+        </w:rPr>
+        <w:t>data_raw = [</w:t>
+      </w:r>
+    </w:p>
+    <w:p>
+      <w:pPr>
+        <w:pStyle w:val="Code"/>
+        <w:rPr>
+          <w:color w:val="auto"/>
+        </w:rPr>
+      </w:pPr>
+      <w:r>
+        <w:rPr>
+          <w:color w:val="auto"/>
+        </w:rPr>
+        <w:t xml:space="preserve">    </w:t>
+      </w:r>
+      <w:r>
+        <w:rPr>
+          <w:color w:val="auto"/>
+        </w:rPr>
+        <w:t>[2.5, 0.07],</w:t>
+      </w:r>
+    </w:p>
+    <w:p>
+      <w:pPr>
+        <w:pStyle w:val="Code"/>
+        <w:rPr>
+          <w:color w:val="auto"/>
+        </w:rPr>
+      </w:pPr>
+      <w:r>
+        <w:rPr>
+          <w:color w:val="auto"/>
+        </w:rPr>
+        <w:t xml:space="preserve">    </w:t>
+      </w:r>
+      <w:r>
+        <w:rPr>
+          <w:color w:val="auto"/>
+        </w:rPr>
+        <w:t>[3.8, 0.07],</w:t>
+      </w:r>
+    </w:p>
+    <w:p>
+      <w:pPr>
+        <w:pStyle w:val="Code"/>
+        <w:rPr>
+          <w:color w:val="auto"/>
+        </w:rPr>
+      </w:pPr>
+      <w:r>
+        <w:rPr>
+          <w:color w:val="auto"/>
+        </w:rPr>
+        <w:t xml:space="preserve">    </w:t>
+      </w:r>
+      <w:r>
+        <w:rPr>
+          <w:color w:val="auto"/>
+        </w:rPr>
+        <w:t>[3.8, 0.09],</w:t>
+      </w:r>
+    </w:p>
+    <w:p>
+      <w:pPr>
+        <w:pStyle w:val="Code"/>
+        <w:rPr>
+          <w:color w:val="auto"/>
+        </w:rPr>
+      </w:pPr>
+      <w:r>
+        <w:rPr>
+          <w:color w:val="auto"/>
+        </w:rPr>
+        <w:t xml:space="preserve">    </w:t>
+      </w:r>
+      <w:r>
+        <w:rPr>
+          <w:color w:val="auto"/>
+        </w:rPr>
+        <w:t>[3.8, 0.15],</w:t>
+      </w:r>
+    </w:p>
+    <w:p>
+      <w:pPr>
+        <w:pStyle w:val="Code"/>
+        <w:rPr>
+          <w:color w:val="auto"/>
+        </w:rPr>
+      </w:pPr>
+      <w:r>
+        <w:rPr>
+          <w:color w:val="auto"/>
+        </w:rPr>
+        <w:t xml:space="preserve">    </w:t>
+      </w:r>
+      <w:r>
+        <w:rPr>
+          <w:color w:val="auto"/>
+        </w:rPr>
+        <w:t>[6.3, 0.15],</w:t>
+      </w:r>
+    </w:p>
+    <w:p>
+      <w:pPr>
+        <w:pStyle w:val="Code"/>
+        <w:rPr>
+          <w:color w:val="auto"/>
+        </w:rPr>
+      </w:pPr>
+      <w:r>
+        <w:rPr>
+          <w:color w:val="auto"/>
+        </w:rPr>
+        <w:t xml:space="preserve">    </w:t>
+      </w:r>
+      <w:r>
+        <w:rPr>
+          <w:color w:val="auto"/>
+        </w:rPr>
+        <w:t>[6.3, 0.18],</w:t>
+      </w:r>
+    </w:p>
+    <w:p>
+      <w:pPr>
+        <w:pStyle w:val="Code"/>
+        <w:rPr>
+          <w:color w:val="auto"/>
+        </w:rPr>
+      </w:pPr>
+      <w:r>
+        <w:rPr>
+          <w:color w:val="auto"/>
+        </w:rPr>
+        <w:t xml:space="preserve">    </w:t>
+      </w:r>
+      <w:r>
+        <w:rPr>
+          <w:color w:val="auto"/>
+        </w:rPr>
+        <w:t>[4.6, 0.10],</w:t>
+      </w:r>
+    </w:p>
+    <w:p>
+      <w:pPr>
+        <w:pStyle w:val="Code"/>
+        <w:rPr>
+          <w:color w:val="auto"/>
+        </w:rPr>
+      </w:pPr>
+      <w:r>
+        <w:rPr>
+          <w:color w:val="auto"/>
+        </w:rPr>
+        <w:t xml:space="preserve">    </w:t>
+      </w:r>
+      <w:r>
+        <w:rPr>
+          <w:color w:val="auto"/>
+        </w:rPr>
+        <w:t>[8.6, 0.28],</w:t>
+      </w:r>
+    </w:p>
+    <w:p>
+      <w:pPr>
+        <w:pStyle w:val="Code"/>
+        <w:rPr>
+          <w:color w:val="auto"/>
+        </w:rPr>
+      </w:pPr>
+      <w:r>
+        <w:rPr>
+          <w:color w:val="auto"/>
+        </w:rPr>
+        <w:t xml:space="preserve">    </w:t>
+      </w:r>
+      <w:r>
+        <w:rPr>
+          <w:color w:val="auto"/>
+        </w:rPr>
+        <w:t>[4.6, 0.15],</w:t>
+      </w:r>
+    </w:p>
+    <w:p>
+      <w:pPr>
+        <w:pStyle w:val="Code"/>
+        <w:rPr>
+          <w:color w:val="auto"/>
+        </w:rPr>
+      </w:pPr>
+      <w:r>
+        <w:rPr>
+          <w:color w:val="auto"/>
+        </w:rPr>
+        <w:t xml:space="preserve">    </w:t>
+      </w:r>
+      <w:r>
+        <w:rPr>
+          <w:color w:val="auto"/>
+        </w:rPr>
+        <w:t>[7.7, 0.23],</w:t>
+      </w:r>
+    </w:p>
+    <w:p>
+      <w:pPr>
+        <w:pStyle w:val="Code"/>
+        <w:rPr>
+          <w:color w:val="auto"/>
+        </w:rPr>
+      </w:pPr>
+      <w:r>
+        <w:rPr>
+          <w:color w:val="auto"/>
+        </w:rPr>
+        <w:t xml:space="preserve">    </w:t>
+      </w:r>
+      <w:r>
+        <w:rPr>
+          <w:color w:val="auto"/>
+        </w:rPr>
+        <w:t>[6.5, 0.22],</w:t>
+      </w:r>
+    </w:p>
+    <w:p>
+      <w:pPr>
+        <w:pStyle w:val="Code"/>
+        <w:rPr>
+          <w:color w:val="auto"/>
+        </w:rPr>
+      </w:pPr>
+      <w:r>
+        <w:rPr>
+          <w:color w:val="auto"/>
+        </w:rPr>
+        <w:t xml:space="preserve">    </w:t>
+      </w:r>
+      <w:r>
+        <w:rPr>
+          <w:color w:val="auto"/>
+        </w:rPr>
+        <w:t>[10.2, 0.27],</w:t>
+      </w:r>
+    </w:p>
+    <w:p>
+      <w:pPr>
+        <w:pStyle w:val="Code"/>
+        <w:rPr>
+          <w:color w:val="auto"/>
+        </w:rPr>
+      </w:pPr>
+      <w:r>
+        <w:rPr>
+          <w:color w:val="auto"/>
+        </w:rPr>
+        <w:t xml:space="preserve">    </w:t>
+      </w:r>
+      <w:r>
+        <w:rPr>
+          <w:color w:val="auto"/>
+        </w:rPr>
+        <w:t>[4.6, 0.18],</w:t>
+      </w:r>
+    </w:p>
+    <w:p>
+      <w:pPr>
+        <w:pStyle w:val="Code"/>
+        <w:rPr>
+          <w:color w:val="auto"/>
+        </w:rPr>
+      </w:pPr>
+      <w:r>
+        <w:rPr>
+          <w:color w:val="auto"/>
+        </w:rPr>
+        <w:t xml:space="preserve">    </w:t>
+      </w:r>
+      <w:r>
+        <w:rPr>
+          <w:color w:val="auto"/>
+        </w:rPr>
+        <w:t>[8.4, 0.26],</w:t>
+      </w:r>
+    </w:p>
+    <w:p>
+      <w:pPr>
+        <w:pStyle w:val="Code"/>
+        <w:rPr>
+          <w:color w:val="auto"/>
+        </w:rPr>
+      </w:pPr>
+      <w:r>
+        <w:rPr>
+          <w:color w:val="auto"/>
+        </w:rPr>
+        <w:t xml:space="preserve">    </w:t>
+      </w:r>
+      <w:r>
+        <w:rPr>
+          <w:color w:val="auto"/>
+        </w:rPr>
+        <w:t>[8.5, 0.27],</w:t>
+      </w:r>
+    </w:p>
+    <w:p>
+      <w:pPr>
+        <w:pStyle w:val="Code"/>
+        <w:rPr>
+          <w:color w:val="auto"/>
+        </w:rPr>
+      </w:pPr>
+      <w:r>
+        <w:rPr>
+          <w:color w:val="auto"/>
+        </w:rPr>
+        <w:t xml:space="preserve">    </w:t>
+      </w:r>
+      <w:r>
+        <w:rPr>
+          <w:color w:val="auto"/>
+        </w:rPr>
+        <w:t>[8.4, 0.18],</w:t>
+      </w:r>
+    </w:p>
+    <w:p>
+      <w:pPr>
+        <w:pStyle w:val="Code"/>
+        <w:rPr>
+          <w:color w:val="auto"/>
+        </w:rPr>
+      </w:pPr>
+      <w:r>
+        <w:rPr>
+          <w:color w:val="auto"/>
+        </w:rPr>
+        <w:t xml:space="preserve">    </w:t>
+      </w:r>
+      <w:r>
+        <w:rPr>
+          <w:color w:val="auto"/>
+        </w:rPr>
+        <w:t>[3.7, 0.05],</w:t>
+      </w:r>
+    </w:p>
+    <w:p>
+      <w:pPr>
+        <w:pStyle w:val="Code"/>
+        <w:rPr>
+          <w:color w:val="auto"/>
+        </w:rPr>
+      </w:pPr>
+      <w:r>
+        <w:rPr>
+          <w:color w:val="auto"/>
+        </w:rPr>
+        <w:t xml:space="preserve">    </w:t>
+      </w:r>
+      <w:r>
+        <w:rPr>
+          <w:color w:val="auto"/>
+        </w:rPr>
+        <w:t>[8.5, 0.28],</w:t>
+      </w:r>
+    </w:p>
+    <w:p>
+      <w:pPr>
+        <w:pStyle w:val="Code"/>
+        <w:rPr>
+          <w:color w:val="auto"/>
+        </w:rPr>
+      </w:pPr>
+      <w:r>
+        <w:rPr>
+          <w:color w:val="auto"/>
+        </w:rPr>
+        <w:t xml:space="preserve">    </w:t>
+      </w:r>
+      <w:r>
+        <w:rPr>
+          <w:color w:val="auto"/>
+        </w:rPr>
+        <w:t>[5.5, 0.10],</w:t>
+      </w:r>
+    </w:p>
+    <w:p>
+      <w:pPr>
+        <w:pStyle w:val="Code"/>
+        <w:rPr>
+          <w:color w:val="auto"/>
+        </w:rPr>
+      </w:pPr>
+      <w:r>
+        <w:rPr>
+          <w:color w:val="auto"/>
+        </w:rPr>
+        <w:t xml:space="preserve">    </w:t>
+      </w:r>
+      <w:r>
+        <w:rPr>
+          <w:color w:val="auto"/>
+        </w:rPr>
+        <w:t>[4.3, 0.08],</w:t>
+      </w:r>
+    </w:p>
+    <w:p>
+      <w:pPr>
+        <w:pStyle w:val="Code"/>
+        <w:rPr>
+          <w:color w:val="auto"/>
+        </w:rPr>
+      </w:pPr>
+      <w:r>
+        <w:rPr>
+          <w:color w:val="auto"/>
+        </w:rPr>
+        <w:t xml:space="preserve">    </w:t>
+      </w:r>
+      <w:r>
+        <w:rPr>
+          <w:color w:val="auto"/>
+        </w:rPr>
+        <w:t>[11.1, 0.30],</w:t>
+      </w:r>
+    </w:p>
+    <w:p>
+      <w:pPr>
+        <w:pStyle w:val="Code"/>
+        <w:rPr>
+          <w:color w:val="auto"/>
+        </w:rPr>
+      </w:pPr>
+      <w:r>
+        <w:rPr>
+          <w:color w:val="auto"/>
+        </w:rPr>
+        <w:t xml:space="preserve">    </w:t>
+      </w:r>
+      <w:r>
+        <w:rPr>
+          <w:color w:val="auto"/>
+        </w:rPr>
+        <w:t>[5.3, 0.08],</w:t>
+      </w:r>
+    </w:p>
+    <w:p>
+      <w:pPr>
+        <w:pStyle w:val="Code"/>
+        <w:rPr>
+          <w:color w:val="auto"/>
+        </w:rPr>
+      </w:pPr>
+      <w:r>
+        <w:rPr>
+          <w:color w:val="auto"/>
+        </w:rPr>
+        <w:t xml:space="preserve">    </w:t>
+      </w:r>
+      <w:r>
+        <w:rPr>
+          <w:color w:val="auto"/>
+        </w:rPr>
+        <w:t>[5.5, 0.15],</w:t>
+      </w:r>
+    </w:p>
+    <w:p>
+      <w:pPr>
+        <w:pStyle w:val="Code"/>
+        <w:rPr>
+          <w:color w:val="auto"/>
+        </w:rPr>
+      </w:pPr>
+      <w:r>
+        <w:rPr>
+          <w:color w:val="auto"/>
+        </w:rPr>
+        <w:t xml:space="preserve">    </w:t>
+      </w:r>
+      <w:r>
+        <w:rPr>
+          <w:color w:val="auto"/>
+        </w:rPr>
+        <w:t>[10.1, 0.24],</w:t>
+      </w:r>
+    </w:p>
+    <w:p>
+      <w:pPr>
+        <w:pStyle w:val="Code"/>
+        <w:rPr>
+          <w:color w:val="auto"/>
+        </w:rPr>
+      </w:pPr>
+      <w:r>
+        <w:rPr>
+          <w:color w:val="auto"/>
+        </w:rPr>
+        <w:t xml:space="preserve">    </w:t>
+      </w:r>
+      <w:r>
+        <w:rPr>
+          <w:color w:val="auto"/>
+        </w:rPr>
+        <w:t>[5.7, 0.15],</w:t>
+      </w:r>
+    </w:p>
+    <w:p>
+      <w:pPr>
+        <w:pStyle w:val="Code"/>
+        <w:rPr>
+          <w:color w:val="auto"/>
+        </w:rPr>
+      </w:pPr>
+      <w:r>
+        <w:rPr>
+          <w:color w:val="auto"/>
+        </w:rPr>
+        <w:t xml:space="preserve">    </w:t>
+      </w:r>
+      <w:r>
+        <w:rPr>
+          <w:color w:val="auto"/>
+        </w:rPr>
+        <w:t>[4.9, 0.17],</w:t>
+      </w:r>
+    </w:p>
+    <w:p>
+      <w:pPr>
+        <w:pStyle w:val="Code"/>
+        <w:rPr>
+          <w:color w:val="auto"/>
+        </w:rPr>
+      </w:pPr>
+      <w:r>
+        <w:rPr>
+          <w:color w:val="auto"/>
+        </w:rPr>
+        <w:t xml:space="preserve">    </w:t>
+      </w:r>
+      <w:r>
+        <w:rPr>
+          <w:color w:val="auto"/>
+        </w:rPr>
+        <w:t>[10.3, 0.27],</w:t>
+      </w:r>
+    </w:p>
+    <w:p>
+      <w:pPr>
+        <w:pStyle w:val="Code"/>
+        <w:rPr>
+          <w:color w:val="auto"/>
+        </w:rPr>
+      </w:pPr>
+      <w:r>
+        <w:rPr>
+          <w:color w:val="auto"/>
+        </w:rPr>
+        <w:t xml:space="preserve">    </w:t>
+      </w:r>
+      <w:r>
+        <w:rPr>
+          <w:color w:val="auto"/>
+        </w:rPr>
+        <w:t>[7.9, 0.24],</w:t>
+      </w:r>
+    </w:p>
+    <w:p>
+      <w:pPr>
+        <w:pStyle w:val="Code"/>
+        <w:rPr>
+          <w:color w:val="auto"/>
+        </w:rPr>
+      </w:pPr>
+      <w:r>
+        <w:rPr>
+          <w:color w:val="auto"/>
+        </w:rPr>
+        <w:t xml:space="preserve">    </w:t>
+      </w:r>
+      <w:r>
+        <w:rPr>
+          <w:color w:val="auto"/>
+        </w:rPr>
+        <w:t>[2.7, 0.06],</w:t>
+      </w:r>
+    </w:p>
+    <w:p>
+      <w:pPr>
+        <w:pStyle w:val="Code"/>
+        <w:rPr>
+          <w:color w:val="auto"/>
+        </w:rPr>
+      </w:pPr>
+      <w:r>
+        <w:rPr>
+          <w:color w:val="auto"/>
+        </w:rPr>
+        <w:t xml:space="preserve">    </w:t>
+      </w:r>
+      <w:r>
+        <w:rPr>
+          <w:color w:val="auto"/>
+        </w:rPr>
+        <w:t>[2.3, 0.05],</w:t>
+      </w:r>
+    </w:p>
+    <w:p>
+      <w:pPr>
+        <w:pStyle w:val="Code"/>
+        <w:rPr>
+          <w:color w:val="auto"/>
+        </w:rPr>
+      </w:pPr>
+      <w:r>
+        <w:rPr>
+          <w:color w:val="auto"/>
+        </w:rPr>
+        <w:t xml:space="preserve">    </w:t>
+      </w:r>
+      <w:r>
+        <w:rPr>
+          <w:color w:val="auto"/>
+        </w:rPr>
+        <w:t>[6.5, 0.18],</w:t>
+      </w:r>
+    </w:p>
+    <w:p>
+      <w:pPr>
+        <w:pStyle w:val="Code"/>
+        <w:rPr>
+          <w:color w:val="auto"/>
+        </w:rPr>
+      </w:pPr>
+      <w:r>
+        <w:rPr>
+          <w:color w:val="auto"/>
+        </w:rPr>
+        <w:t xml:space="preserve">    </w:t>
+      </w:r>
+      <w:r>
+        <w:rPr>
+          <w:color w:val="auto"/>
+        </w:rPr>
+        <w:t>[5.7, 0.12],</w:t>
+      </w:r>
+    </w:p>
+    <w:p>
+      <w:pPr>
+        <w:pStyle w:val="Code"/>
+        <w:rPr>
+          <w:color w:val="auto"/>
+        </w:rPr>
+      </w:pPr>
+      <w:r>
+        <w:rPr>
+          <w:color w:val="auto"/>
+        </w:rPr>
+        <w:t xml:space="preserve">    </w:t>
+      </w:r>
+      <w:r>
+        <w:rPr>
+          <w:color w:val="auto"/>
+        </w:rPr>
+        <w:t>[4.7, 0.20],</w:t>
+      </w:r>
+    </w:p>
+    <w:p>
+      <w:pPr>
+        <w:pStyle w:val="Code"/>
+        <w:rPr>
+          <w:color w:val="auto"/>
+        </w:rPr>
+      </w:pPr>
+      <w:r>
+        <w:rPr>
+          <w:color w:val="auto"/>
+        </w:rPr>
+        <w:t xml:space="preserve">    </w:t>
+      </w:r>
+      <w:r>
+        <w:rPr>
+          <w:color w:val="auto"/>
+        </w:rPr>
+        <w:t>[8.5, 0.22],</w:t>
+      </w:r>
+    </w:p>
+    <w:p>
+      <w:pPr>
+        <w:pStyle w:val="Code"/>
+        <w:rPr>
+          <w:color w:val="auto"/>
+        </w:rPr>
+      </w:pPr>
+      <w:r>
+        <w:rPr>
+          <w:color w:val="auto"/>
+        </w:rPr>
+        <w:t xml:space="preserve">    </w:t>
+      </w:r>
+      <w:r>
+        <w:rPr>
+          <w:color w:val="auto"/>
+        </w:rPr>
+        <w:t>[5.5, 0.11],</w:t>
+      </w:r>
+    </w:p>
+    <w:p>
+      <w:pPr>
+        <w:pStyle w:val="Code"/>
+        <w:rPr>
+          <w:color w:val="auto"/>
+        </w:rPr>
+      </w:pPr>
+      <w:r>
+        <w:rPr>
+          <w:color w:val="auto"/>
+        </w:rPr>
+        <w:t xml:space="preserve">    </w:t>
+      </w:r>
+      <w:r>
+        <w:rPr>
+          <w:color w:val="auto"/>
+        </w:rPr>
+        <w:t>[4.6, 0.11],</w:t>
+      </w:r>
+    </w:p>
+    <w:p>
+      <w:pPr>
+        <w:pStyle w:val="Code"/>
+        <w:rPr>
+          <w:color w:val="auto"/>
+        </w:rPr>
+      </w:pPr>
+      <w:r>
+        <w:rPr>
+          <w:color w:val="auto"/>
+        </w:rPr>
+        <w:t xml:space="preserve">    </w:t>
+      </w:r>
+      <w:r>
+        <w:rPr>
+          <w:color w:val="auto"/>
+        </w:rPr>
+        <w:t>[8.8, 0.30],</w:t>
+      </w:r>
+    </w:p>
+    <w:p>
+      <w:pPr>
+        <w:pStyle w:val="Code"/>
+        <w:rPr>
+          <w:color w:val="auto"/>
+        </w:rPr>
+      </w:pPr>
+      <w:r>
+        <w:rPr>
+          <w:color w:val="auto"/>
+        </w:rPr>
+        <w:t xml:space="preserve">    </w:t>
+      </w:r>
+      <w:r>
+        <w:rPr>
+          <w:color w:val="auto"/>
+        </w:rPr>
+        <w:t>[8.5, 0.27],</w:t>
+      </w:r>
+    </w:p>
+    <w:p>
+      <w:pPr>
+        <w:pStyle w:val="Code"/>
+        <w:rPr>
+          <w:color w:val="auto"/>
+        </w:rPr>
+      </w:pPr>
+      <w:r>
+        <w:rPr>
+          <w:color w:val="auto"/>
+        </w:rPr>
+        <w:t xml:space="preserve">    </w:t>
+      </w:r>
+      <w:r>
+        <w:rPr>
+          <w:color w:val="auto"/>
+        </w:rPr>
+        <w:t>[5.8, 0.16],</w:t>
+      </w:r>
+    </w:p>
+    <w:p>
+      <w:pPr>
+        <w:pStyle w:val="Code"/>
+        <w:rPr>
+          <w:color w:val="auto"/>
+        </w:rPr>
+      </w:pPr>
+      <w:r>
+        <w:rPr>
+          <w:color w:val="auto"/>
+        </w:rPr>
+        <w:t xml:space="preserve">    </w:t>
+      </w:r>
+      <w:r>
+        <w:rPr>
+          <w:color w:val="auto"/>
+        </w:rPr>
+        <w:t>[7.6, 0.22],</w:t>
+      </w:r>
+    </w:p>
+    <w:p>
+      <w:pPr>
+        <w:pStyle w:val="Code"/>
+        <w:rPr>
+          <w:color w:val="auto"/>
+        </w:rPr>
+      </w:pPr>
+      <w:r>
+        <w:rPr>
+          <w:color w:val="auto"/>
+        </w:rPr>
+        <w:t xml:space="preserve">    </w:t>
+      </w:r>
+      <w:r>
+        <w:rPr>
+          <w:color w:val="auto"/>
+        </w:rPr>
+        <w:t>[3.7, 0.04],</w:t>
+      </w:r>
+    </w:p>
+    <w:p>
+      <w:pPr>
+        <w:pStyle w:val="Code"/>
+        <w:rPr>
+          <w:color w:val="auto"/>
+        </w:rPr>
+      </w:pPr>
+      <w:r>
+        <w:rPr>
+          <w:color w:val="auto"/>
+        </w:rPr>
+        <w:t xml:space="preserve">    </w:t>
+      </w:r>
+      <w:r>
+        <w:rPr>
+          <w:color w:val="auto"/>
+        </w:rPr>
+        <w:t>[6.5, 0.17],</w:t>
+      </w:r>
+    </w:p>
+    <w:p>
+      <w:pPr>
+        <w:pStyle w:val="Code"/>
+        <w:rPr>
+          <w:color w:val="auto"/>
+        </w:rPr>
+      </w:pPr>
+      <w:r>
+        <w:rPr>
+          <w:color w:val="auto"/>
+        </w:rPr>
+        <w:t xml:space="preserve">    </w:t>
+      </w:r>
+      <w:r>
+        <w:rPr>
+          <w:color w:val="auto"/>
+        </w:rPr>
+        <w:t>[6.7, 0.18],</w:t>
+      </w:r>
+    </w:p>
+    <w:p>
+      <w:pPr>
+        <w:pStyle w:val="Code"/>
+        <w:rPr>
+          <w:color w:val="auto"/>
+        </w:rPr>
+      </w:pPr>
+      <w:r>
+        <w:rPr>
+          <w:color w:val="auto"/>
+        </w:rPr>
+        <w:t xml:space="preserve">    </w:t>
+      </w:r>
+      <w:r>
+        <w:rPr>
+          <w:color w:val="auto"/>
+        </w:rPr>
+        <w:t>[11.3, 0.31],</w:t>
+      </w:r>
+    </w:p>
+    <w:p>
+      <w:pPr>
+        <w:pStyle w:val="Code"/>
+        <w:rPr>
+          <w:color w:val="auto"/>
+        </w:rPr>
+      </w:pPr>
+      <w:r>
+        <w:rPr>
+          <w:color w:val="auto"/>
+        </w:rPr>
+        <w:t xml:space="preserve">    </w:t>
+      </w:r>
+      <w:r>
+        <w:rPr>
+          <w:color w:val="auto"/>
+        </w:rPr>
+        <w:t>[10.3, 0.29],</w:t>
+      </w:r>
+    </w:p>
+    <w:p>
+      <w:pPr>
+        <w:pStyle w:val="Code"/>
+        <w:rPr>
+          <w:color w:val="auto"/>
+        </w:rPr>
+      </w:pPr>
+      <w:r>
+        <w:rPr>
+          <w:color w:val="auto"/>
+        </w:rPr>
+        <w:t xml:space="preserve">    </w:t>
+      </w:r>
+      <w:r>
+        <w:rPr>
+          <w:color w:val="auto"/>
+        </w:rPr>
+        <w:t>[6.3, 0.16],</w:t>
+      </w:r>
+    </w:p>
+    <w:p>
+      <w:pPr>
+        <w:pStyle w:val="Code"/>
+        <w:rPr>
+          <w:color w:val="auto"/>
+        </w:rPr>
+      </w:pPr>
+      <w:r>
+        <w:rPr>
+          <w:color w:val="auto"/>
+        </w:rPr>
+        <w:t xml:space="preserve">    </w:t>
+      </w:r>
+      <w:r>
+        <w:rPr>
+          <w:color w:val="auto"/>
+        </w:rPr>
+        <w:t>[8.6, 0.31],</w:t>
+      </w:r>
+    </w:p>
+    <w:p>
+      <w:pPr>
+        <w:pStyle w:val="Code"/>
+        <w:rPr>
+          <w:color w:val="auto"/>
+        </w:rPr>
+      </w:pPr>
+      <w:r>
+        <w:rPr>
+          <w:color w:val="auto"/>
+        </w:rPr>
+        <w:t xml:space="preserve">    </w:t>
+      </w:r>
+      <w:r>
+        <w:rPr>
+          <w:color w:val="auto"/>
+        </w:rPr>
+        <w:t>[13.0, 0.34],</w:t>
+      </w:r>
+    </w:p>
+    <w:p>
+      <w:pPr>
+        <w:pStyle w:val="Code"/>
+        <w:rPr>
+          <w:color w:val="auto"/>
+        </w:rPr>
+      </w:pPr>
+      <w:r>
+        <w:rPr>
+          <w:color w:val="auto"/>
+        </w:rPr>
+        <w:t xml:space="preserve">    </w:t>
+      </w:r>
+      <w:r>
+        <w:rPr>
+          <w:color w:val="auto"/>
+        </w:rPr>
+        <w:t>[10.2, 0.26],</w:t>
+      </w:r>
+    </w:p>
+    <w:p>
+      <w:pPr>
+        <w:pStyle w:val="Code"/>
+        <w:rPr>
+          <w:color w:val="auto"/>
+        </w:rPr>
+      </w:pPr>
+      <w:r>
+        <w:rPr>
+          <w:color w:val="auto"/>
+        </w:rPr>
+        <w:t xml:space="preserve">    </w:t>
+      </w:r>
+      <w:r>
+        <w:rPr>
+          <w:color w:val="auto"/>
+        </w:rPr>
+        <w:t>[12.0, 0.35],</w:t>
+      </w:r>
+    </w:p>
+    <w:p>
+      <w:pPr>
+        <w:pStyle w:val="Code"/>
+        <w:rPr>
+          <w:color w:val="auto"/>
+        </w:rPr>
+      </w:pPr>
+      <w:r>
+        <w:rPr>
+          <w:color w:val="auto"/>
+        </w:rPr>
+        <w:t xml:space="preserve">    </w:t>
+      </w:r>
+      <w:r>
+        <w:rPr>
+          <w:color w:val="auto"/>
+        </w:rPr>
+        <w:t>[5.7, 0.17],</w:t>
+      </w:r>
+    </w:p>
+    <w:p>
+      <w:pPr>
+        <w:pStyle w:val="Code"/>
+        <w:rPr>
+          <w:color w:val="auto"/>
+        </w:rPr>
+      </w:pPr>
+      <w:r>
+        <w:rPr>
+          <w:color w:val="auto"/>
+        </w:rPr>
+        <w:t xml:space="preserve">    </w:t>
+      </w:r>
+      <w:r>
+        <w:rPr>
+          <w:color w:val="auto"/>
+        </w:rPr>
+        <w:t>[10.3, 0.30],</w:t>
+      </w:r>
+    </w:p>
+    <w:p>
+      <w:pPr>
+        <w:pStyle w:val="Code"/>
+        <w:rPr>
+          <w:color w:val="auto"/>
+        </w:rPr>
+      </w:pPr>
+      <w:r>
+        <w:rPr>
+          <w:color w:val="auto"/>
+        </w:rPr>
+        <w:t xml:space="preserve">    </w:t>
+      </w:r>
+      <w:r>
+        <w:rPr>
+          <w:color w:val="auto"/>
+        </w:rPr>
+        <w:t>[5.5, 0.10],</w:t>
+      </w:r>
+    </w:p>
+    <w:p>
+      <w:pPr>
+        <w:pStyle w:val="Code"/>
+        <w:rPr>
+          <w:color w:val="auto"/>
+        </w:rPr>
+      </w:pPr>
+      <w:r>
+        <w:rPr>
+          <w:color w:val="auto"/>
+        </w:rPr>
+        <w:t xml:space="preserve">    </w:t>
+      </w:r>
+      <w:r>
+        <w:rPr>
+          <w:color w:val="auto"/>
+        </w:rPr>
+        <w:t>[3.4, 0.03],</w:t>
+      </w:r>
+    </w:p>
+    <w:p>
+      <w:pPr>
+        <w:pStyle w:val="Code"/>
+        <w:rPr>
+          <w:color w:val="auto"/>
+        </w:rPr>
+      </w:pPr>
+      <w:r>
+        <w:rPr>
+          <w:color w:val="auto"/>
+        </w:rPr>
+        <w:t xml:space="preserve">    </w:t>
+      </w:r>
+      <w:r>
+        <w:rPr>
+          <w:color w:val="auto"/>
+        </w:rPr>
+        <w:t>[7.9, 0.24],</w:t>
+      </w:r>
+    </w:p>
+    <w:p>
+      <w:pPr>
+        <w:pStyle w:val="Code"/>
+        <w:rPr>
+          <w:color w:val="auto"/>
+        </w:rPr>
+      </w:pPr>
+      <w:r>
+        <w:rPr>
+          <w:color w:val="auto"/>
+        </w:rPr>
+        <w:t xml:space="preserve">    </w:t>
+      </w:r>
+      <w:r>
+        <w:rPr>
+          <w:color w:val="auto"/>
+        </w:rPr>
+        <w:t>[4.9, 0.18],</w:t>
+      </w:r>
+    </w:p>
+    <w:p>
+      <w:pPr>
+        <w:pStyle w:val="Code"/>
+        <w:rPr>
+          <w:color w:val="auto"/>
+        </w:rPr>
+      </w:pPr>
+      <w:r>
+        <w:rPr>
+          <w:color w:val="auto"/>
+        </w:rPr>
+        <w:t xml:space="preserve">    </w:t>
+      </w:r>
+      <w:r>
+        <w:rPr>
+          <w:color w:val="auto"/>
+        </w:rPr>
+        <w:t>[10.3, 0.28],</w:t>
+      </w:r>
+    </w:p>
+    <w:p>
+      <w:pPr>
+        <w:pStyle w:val="Code"/>
+        <w:rPr>
+          <w:color w:val="auto"/>
+        </w:rPr>
+      </w:pPr>
+      <w:r>
+        <w:rPr>
+          <w:color w:val="auto"/>
+        </w:rPr>
+        <w:t xml:space="preserve">    </w:t>
+      </w:r>
+      <w:r>
+        <w:rPr>
+          <w:color w:val="auto"/>
+        </w:rPr>
+        <w:t>[4.6, 0.09],</w:t>
+      </w:r>
+    </w:p>
+    <w:p>
+      <w:pPr>
+        <w:pStyle w:val="Code"/>
+        <w:rPr>
+          <w:color w:val="auto"/>
+        </w:rPr>
+      </w:pPr>
+      <w:r>
+        <w:rPr>
+          <w:color w:val="auto"/>
+        </w:rPr>
+        <w:t xml:space="preserve">    </w:t>
+      </w:r>
+      <w:r>
+        <w:rPr>
+          <w:color w:val="auto"/>
+        </w:rPr>
+        <w:t>[8.4, 0.27],</w:t>
+      </w:r>
+    </w:p>
+    <w:p>
+      <w:pPr>
+        <w:pStyle w:val="Code"/>
+        <w:rPr>
+          <w:color w:val="auto"/>
+        </w:rPr>
+      </w:pPr>
+      <w:r>
+        <w:rPr>
+          <w:color w:val="auto"/>
+        </w:rPr>
+        <w:t xml:space="preserve">    </w:t>
+      </w:r>
+      <w:r>
+        <w:rPr>
+          <w:color w:val="auto"/>
+        </w:rPr>
+        <w:t>[8.5, 0.29],</w:t>
+      </w:r>
+    </w:p>
+    <w:p>
+      <w:pPr>
+        <w:pStyle w:val="Code"/>
+        <w:rPr>
+          <w:color w:val="auto"/>
+        </w:rPr>
+      </w:pPr>
+      <w:r>
+        <w:rPr>
+          <w:color w:val="auto"/>
+        </w:rPr>
+        <w:t>]</w:t>
+      </w:r>
+    </w:p>
+    <w:p>
+      <w:pPr>
+        <w:pStyle w:val="Code"/>
+        <w:rPr>
+          <w:color w:val="auto"/>
+        </w:rPr>
+      </w:pPr>
+      <w:r>
+        <w:rPr>
+          <w:color w:val="auto"/>
+        </w:rPr>
+      </w:r>
+    </w:p>
+    <w:p>
+      <w:pPr>
+        <w:pStyle w:val="Code"/>
+        <w:rPr>
+          <w:color w:val="auto"/>
+        </w:rPr>
+      </w:pPr>
+      <w:r>
+        <w:rPr>
+          <w:color w:val="auto"/>
+        </w:rPr>
+        <w:t>df = pd.DataFrame(data_raw, columns=["U_sh_base", "alpha"])</w:t>
+      </w:r>
+    </w:p>
+    <w:p>
+      <w:pPr>
+        <w:pStyle w:val="Code"/>
+        <w:rPr>
+          <w:color w:val="auto"/>
+        </w:rPr>
+      </w:pPr>
+      <w:r>
+        <w:rPr>
+          <w:color w:val="auto"/>
+        </w:rPr>
+      </w:r>
+    </w:p>
+    <w:p>
+      <w:pPr>
+        <w:pStyle w:val="Code"/>
+        <w:rPr>
+          <w:color w:val="auto"/>
+        </w:rPr>
+      </w:pPr>
+      <w:r>
+        <w:rPr>
+          <w:color w:val="auto"/>
+        </w:rPr>
+        <w:t># Модифікація згідно з варіантом (п. 1.3.1 Примітка)</w:t>
+      </w:r>
+    </w:p>
+    <w:p>
+      <w:pPr>
+        <w:pStyle w:val="Code"/>
+        <w:rPr>
+          <w:color w:val="auto"/>
+        </w:rPr>
+      </w:pPr>
+      <w:r>
+        <w:rPr>
+          <w:color w:val="auto"/>
+        </w:rPr>
+        <w:t>df["U_sh"] = df["U_sh_base"] * VARIANT</w:t>
+      </w:r>
+    </w:p>
+    <w:p>
+      <w:pPr>
+        <w:pStyle w:val="Code"/>
+        <w:rPr>
+          <w:color w:val="auto"/>
+        </w:rPr>
+      </w:pPr>
+      <w:r>
+        <w:rPr>
+          <w:color w:val="auto"/>
+        </w:rPr>
+      </w:r>
+    </w:p>
+    <w:p>
+      <w:pPr>
+        <w:pStyle w:val="Code"/>
+        <w:rPr>
+          <w:color w:val="auto"/>
+        </w:rPr>
+      </w:pPr>
+      <w:r>
+        <w:rPr>
+          <w:color w:val="auto"/>
+        </w:rPr>
+        <w:t># ==========================================</w:t>
+      </w:r>
+    </w:p>
+    <w:p>
+      <w:pPr>
+        <w:pStyle w:val="Code"/>
+        <w:rPr>
+          <w:color w:val="auto"/>
+        </w:rPr>
+      </w:pPr>
+      <w:r>
+        <w:rPr>
+          <w:color w:val="auto"/>
+        </w:rPr>
+        <w:t># 2. КЛАСИФІКАЦІЯ (п. 1.3.1)</w:t>
+      </w:r>
+    </w:p>
+    <w:p>
+      <w:pPr>
+        <w:pStyle w:val="Code"/>
+        <w:rPr>
+          <w:color w:val="auto"/>
+        </w:rPr>
+      </w:pPr>
+      <w:r>
+        <w:rPr>
+          <w:color w:val="auto"/>
+        </w:rPr>
+        <w:t># ==========================================</w:t>
+      </w:r>
+    </w:p>
+    <w:p>
+      <w:pPr>
+        <w:pStyle w:val="Code"/>
+        <w:rPr>
+          <w:color w:val="auto"/>
+        </w:rPr>
+      </w:pPr>
+      <w:r>
+        <w:rPr>
+          <w:color w:val="auto"/>
+        </w:rPr>
+        <w:t># Порогове значення альфа (середнє)</w:t>
+      </w:r>
+    </w:p>
+    <w:p>
+      <w:pPr>
+        <w:pStyle w:val="Code"/>
+        <w:rPr>
+          <w:color w:val="auto"/>
+        </w:rPr>
+      </w:pPr>
+      <w:r>
+        <w:rPr>
+          <w:color w:val="auto"/>
+        </w:rPr>
+        <w:t>alpha_threshold = df["alpha"].mean()</w:t>
+      </w:r>
+    </w:p>
+    <w:p>
+      <w:pPr>
+        <w:pStyle w:val="Code"/>
+        <w:rPr>
+          <w:color w:val="auto"/>
+        </w:rPr>
+      </w:pPr>
+      <w:r>
+        <w:rPr>
+          <w:color w:val="auto"/>
+        </w:rPr>
+        <w:t>print(f"Порогове значення параметра alpha (Y_gr): {alpha_threshold:.4f}")</w:t>
+      </w:r>
+    </w:p>
+    <w:p>
+      <w:pPr>
+        <w:pStyle w:val="Code"/>
+        <w:rPr>
+          <w:color w:val="auto"/>
+        </w:rPr>
+      </w:pPr>
+      <w:r>
+        <w:rPr>
+          <w:color w:val="auto"/>
+        </w:rPr>
+      </w:r>
+    </w:p>
+    <w:p>
+      <w:pPr>
+        <w:pStyle w:val="Code"/>
+        <w:rPr>
+          <w:color w:val="auto"/>
+        </w:rPr>
+      </w:pPr>
+      <w:r>
+        <w:rPr>
+          <w:color w:val="auto"/>
+        </w:rPr>
+        <w:t># Визначення істинних класів</w:t>
+      </w:r>
+    </w:p>
+    <w:p>
+      <w:pPr>
+        <w:pStyle w:val="Code"/>
+        <w:rPr>
+          <w:color w:val="auto"/>
+        </w:rPr>
+      </w:pPr>
+      <w:r>
+        <w:rPr>
+          <w:color w:val="auto"/>
+        </w:rPr>
+        <w:t># K1 (Good) = 0, K2 (Bad) = 1 для зручності коду, але у виводі буде К1/К2</w:t>
+      </w:r>
+    </w:p>
+    <w:p>
+      <w:pPr>
+        <w:pStyle w:val="Code"/>
+        <w:rPr>
+          <w:color w:val="auto"/>
+        </w:rPr>
+      </w:pPr>
+      <w:r>
+        <w:rPr>
+          <w:color w:val="auto"/>
+        </w:rPr>
+        <w:t>df["True_Class"] = np.where(df["alpha"] &lt;= alpha_threshold, "K1", "K2")</w:t>
+      </w:r>
+    </w:p>
+    <w:p>
+      <w:pPr>
+        <w:pStyle w:val="Code"/>
+        <w:rPr>
+          <w:color w:val="auto"/>
+        </w:rPr>
+      </w:pPr>
+      <w:r>
+        <w:rPr>
+          <w:color w:val="auto"/>
+        </w:rPr>
+      </w:r>
+    </w:p>
+    <w:p>
+      <w:pPr>
+        <w:pStyle w:val="Code"/>
+        <w:rPr>
+          <w:color w:val="auto"/>
+        </w:rPr>
+      </w:pPr>
+      <w:r>
+        <w:rPr>
+          <w:color w:val="auto"/>
+        </w:rPr>
+        <w:t># ==========================================</w:t>
+      </w:r>
+    </w:p>
+    <w:p>
+      <w:pPr>
+        <w:pStyle w:val="Code"/>
+        <w:rPr>
+          <w:color w:val="auto"/>
+        </w:rPr>
+      </w:pPr>
+      <w:r>
+        <w:rPr>
+          <w:color w:val="auto"/>
+        </w:rPr>
+        <w:t># 3. ПОБУДОВА ПОЛЯ КОРЕЛЯЦІЇ (п. 1.3.2, 1.3.3)</w:t>
+      </w:r>
+    </w:p>
+    <w:p>
+      <w:pPr>
+        <w:pStyle w:val="Code"/>
+        <w:rPr>
+          <w:color w:val="auto"/>
+        </w:rPr>
+      </w:pPr>
+      <w:r>
+        <w:rPr>
+          <w:color w:val="auto"/>
+        </w:rPr>
+        <w:t># ==========================================</w:t>
+      </w:r>
+    </w:p>
+    <w:p>
+      <w:pPr>
+        <w:pStyle w:val="Code"/>
+        <w:rPr>
+          <w:color w:val="auto"/>
+        </w:rPr>
+      </w:pPr>
+      <w:r>
+        <w:rPr>
+          <w:color w:val="auto"/>
+        </w:rPr>
+        <w:t>plt.figure(figsize=(10, 6))</w:t>
+      </w:r>
+    </w:p>
+    <w:p>
+      <w:pPr>
+        <w:pStyle w:val="Code"/>
+        <w:rPr>
+          <w:color w:val="auto"/>
+        </w:rPr>
+      </w:pPr>
+      <w:r>
+        <w:rPr>
+          <w:color w:val="auto"/>
+        </w:rPr>
+        <w:t># Точки класу К1</w:t>
+      </w:r>
+    </w:p>
+    <w:p>
+      <w:pPr>
+        <w:pStyle w:val="Code"/>
+        <w:rPr>
+          <w:color w:val="auto"/>
+        </w:rPr>
+      </w:pPr>
+      <w:r>
+        <w:rPr>
+          <w:color w:val="auto"/>
+        </w:rPr>
+        <w:t>k1_points = df[df["True_Class"] == "K1"]</w:t>
+      </w:r>
+    </w:p>
+    <w:p>
+      <w:pPr>
+        <w:pStyle w:val="Code"/>
+        <w:rPr>
+          <w:color w:val="auto"/>
+        </w:rPr>
+      </w:pPr>
+      <w:r>
+        <w:rPr>
+          <w:color w:val="auto"/>
+        </w:rPr>
+        <w:t>plt.scatter(</w:t>
+      </w:r>
+    </w:p>
+    <w:p>
+      <w:pPr>
+        <w:pStyle w:val="Code"/>
+        <w:rPr>
+          <w:color w:val="auto"/>
+        </w:rPr>
+      </w:pPr>
+      <w:r>
+        <w:rPr>
+          <w:color w:val="auto"/>
+        </w:rPr>
+        <w:t xml:space="preserve">    </w:t>
+      </w:r>
+      <w:r>
+        <w:rPr>
+          <w:color w:val="auto"/>
+        </w:rPr>
+        <w:t>k1_points["U_sh"],</w:t>
+      </w:r>
+    </w:p>
+    <w:p>
+      <w:pPr>
+        <w:pStyle w:val="Code"/>
+        <w:rPr>
+          <w:color w:val="auto"/>
+        </w:rPr>
+      </w:pPr>
+      <w:r>
+        <w:rPr>
+          <w:color w:val="auto"/>
+        </w:rPr>
+        <w:t xml:space="preserve">    </w:t>
+      </w:r>
+      <w:r>
+        <w:rPr>
+          <w:color w:val="auto"/>
+        </w:rPr>
+        <w:t>k1_points["alpha"],</w:t>
+      </w:r>
+    </w:p>
+    <w:p>
+      <w:pPr>
+        <w:pStyle w:val="Code"/>
+        <w:rPr>
+          <w:color w:val="auto"/>
+        </w:rPr>
+      </w:pPr>
+      <w:r>
+        <w:rPr>
+          <w:color w:val="auto"/>
+        </w:rPr>
+        <w:t xml:space="preserve">    </w:t>
+      </w:r>
+      <w:r>
+        <w:rPr>
+          <w:color w:val="auto"/>
+        </w:rPr>
+        <w:t>color="green",</w:t>
+      </w:r>
+    </w:p>
+    <w:p>
+      <w:pPr>
+        <w:pStyle w:val="Code"/>
+        <w:rPr>
+          <w:color w:val="auto"/>
+        </w:rPr>
+      </w:pPr>
+      <w:r>
+        <w:rPr>
+          <w:color w:val="auto"/>
+        </w:rPr>
+        <w:t xml:space="preserve">    </w:t>
+      </w:r>
+      <w:r>
+        <w:rPr>
+          <w:color w:val="auto"/>
+        </w:rPr>
+        <w:t>label="Клас К1 (Норма)",</w:t>
+      </w:r>
+    </w:p>
+    <w:p>
+      <w:pPr>
+        <w:pStyle w:val="Code"/>
+        <w:rPr>
+          <w:color w:val="auto"/>
+        </w:rPr>
+      </w:pPr>
+      <w:r>
+        <w:rPr>
+          <w:color w:val="auto"/>
+        </w:rPr>
+        <w:t xml:space="preserve">    </w:t>
+      </w:r>
+      <w:r>
+        <w:rPr>
+          <w:color w:val="auto"/>
+        </w:rPr>
+        <w:t>marker="o",</w:t>
+      </w:r>
+    </w:p>
+    <w:p>
+      <w:pPr>
+        <w:pStyle w:val="Code"/>
+        <w:rPr>
+          <w:color w:val="auto"/>
+        </w:rPr>
+      </w:pPr>
+      <w:r>
+        <w:rPr>
+          <w:color w:val="auto"/>
+        </w:rPr>
+        <w:t>)</w:t>
+      </w:r>
+    </w:p>
+    <w:p>
+      <w:pPr>
+        <w:pStyle w:val="Code"/>
+        <w:rPr>
+          <w:color w:val="auto"/>
+        </w:rPr>
+      </w:pPr>
+      <w:r>
+        <w:rPr>
+          <w:color w:val="auto"/>
+        </w:rPr>
+        <w:t># Точки класу К2</w:t>
+      </w:r>
+    </w:p>
+    <w:p>
+      <w:pPr>
+        <w:pStyle w:val="Code"/>
+        <w:rPr>
+          <w:color w:val="auto"/>
+        </w:rPr>
+      </w:pPr>
+      <w:r>
+        <w:rPr>
+          <w:color w:val="auto"/>
+        </w:rPr>
+        <w:t>k2_points = df[df["True_Class"] == "K2"]</w:t>
+      </w:r>
+    </w:p>
+    <w:p>
+      <w:pPr>
+        <w:pStyle w:val="Code"/>
+        <w:rPr>
+          <w:color w:val="auto"/>
+        </w:rPr>
+      </w:pPr>
+      <w:r>
+        <w:rPr>
+          <w:color w:val="auto"/>
+        </w:rPr>
+        <w:t>plt.scatter(</w:t>
+      </w:r>
+    </w:p>
+    <w:p>
+      <w:pPr>
+        <w:pStyle w:val="Code"/>
+        <w:rPr>
+          <w:color w:val="auto"/>
+        </w:rPr>
+      </w:pPr>
+      <w:r>
+        <w:rPr>
+          <w:color w:val="auto"/>
+        </w:rPr>
+        <w:t xml:space="preserve">    </w:t>
+      </w:r>
+      <w:r>
+        <w:rPr>
+          <w:color w:val="auto"/>
+        </w:rPr>
+        <w:t>k2_points["U_sh"],</w:t>
+      </w:r>
+    </w:p>
+    <w:p>
+      <w:pPr>
+        <w:pStyle w:val="Code"/>
+        <w:rPr>
+          <w:color w:val="auto"/>
+        </w:rPr>
+      </w:pPr>
+      <w:r>
+        <w:rPr>
+          <w:color w:val="auto"/>
+        </w:rPr>
+        <w:t xml:space="preserve">    </w:t>
+      </w:r>
+      <w:r>
+        <w:rPr>
+          <w:color w:val="auto"/>
+        </w:rPr>
+        <w:t>k2_points["alpha"],</w:t>
+      </w:r>
+    </w:p>
+    <w:p>
+      <w:pPr>
+        <w:pStyle w:val="Code"/>
+        <w:rPr>
+          <w:color w:val="auto"/>
+        </w:rPr>
+      </w:pPr>
+      <w:r>
+        <w:rPr>
+          <w:color w:val="auto"/>
+        </w:rPr>
+        <w:t xml:space="preserve">    </w:t>
+      </w:r>
+      <w:r>
+        <w:rPr>
+          <w:color w:val="auto"/>
+        </w:rPr>
+        <w:t>color="red",</w:t>
+      </w:r>
+    </w:p>
+    <w:p>
+      <w:pPr>
+        <w:pStyle w:val="Code"/>
+        <w:rPr>
+          <w:color w:val="auto"/>
+        </w:rPr>
+      </w:pPr>
+      <w:r>
+        <w:rPr>
+          <w:color w:val="auto"/>
+        </w:rPr>
+        <w:t xml:space="preserve">    </w:t>
+      </w:r>
+      <w:r>
+        <w:rPr>
+          <w:color w:val="auto"/>
+        </w:rPr>
+        <w:t>label="Клас К2 (Брак)",</w:t>
+      </w:r>
+    </w:p>
+    <w:p>
+      <w:pPr>
+        <w:pStyle w:val="Code"/>
+        <w:rPr>
+          <w:color w:val="auto"/>
+        </w:rPr>
+      </w:pPr>
+      <w:r>
+        <w:rPr>
+          <w:color w:val="auto"/>
+        </w:rPr>
+        <w:t xml:space="preserve">    </w:t>
+      </w:r>
+      <w:r>
+        <w:rPr>
+          <w:color w:val="auto"/>
+        </w:rPr>
+        <w:t>marker="x",</w:t>
+      </w:r>
+    </w:p>
+    <w:p>
+      <w:pPr>
+        <w:pStyle w:val="Code"/>
+        <w:rPr>
+          <w:color w:val="auto"/>
+        </w:rPr>
+      </w:pPr>
+      <w:r>
+        <w:rPr>
+          <w:color w:val="auto"/>
+        </w:rPr>
+        <w:t>)</w:t>
+      </w:r>
+    </w:p>
+    <w:p>
+      <w:pPr>
+        <w:pStyle w:val="Code"/>
+        <w:rPr>
+          <w:color w:val="auto"/>
+        </w:rPr>
+      </w:pPr>
+      <w:r>
+        <w:rPr>
+          <w:color w:val="auto"/>
+        </w:rPr>
+      </w:r>
+    </w:p>
+    <w:p>
+      <w:pPr>
+        <w:pStyle w:val="Code"/>
+        <w:rPr>
+          <w:color w:val="auto"/>
+        </w:rPr>
+      </w:pPr>
+      <w:r>
+        <w:rPr>
+          <w:color w:val="auto"/>
+        </w:rPr>
+        <w:t>plt.axhline(</w:t>
+      </w:r>
+    </w:p>
+    <w:p>
+      <w:pPr>
+        <w:pStyle w:val="Code"/>
+        <w:rPr>
+          <w:color w:val="auto"/>
+        </w:rPr>
+      </w:pPr>
+      <w:r>
+        <w:rPr>
+          <w:color w:val="auto"/>
+        </w:rPr>
+        <w:t xml:space="preserve">    </w:t>
+      </w:r>
+      <w:r>
+        <w:rPr>
+          <w:color w:val="auto"/>
+        </w:rPr>
+        <w:t>y=alpha_threshold,</w:t>
+      </w:r>
+    </w:p>
+    <w:p>
+      <w:pPr>
+        <w:pStyle w:val="Code"/>
+        <w:rPr>
+          <w:color w:val="auto"/>
+        </w:rPr>
+      </w:pPr>
+      <w:r>
+        <w:rPr>
+          <w:color w:val="auto"/>
+        </w:rPr>
+        <w:t xml:space="preserve">    </w:t>
+      </w:r>
+      <w:r>
+        <w:rPr>
+          <w:color w:val="auto"/>
+        </w:rPr>
+        <w:t>color="blue",</w:t>
+      </w:r>
+    </w:p>
+    <w:p>
+      <w:pPr>
+        <w:pStyle w:val="Code"/>
+        <w:rPr>
+          <w:color w:val="auto"/>
+        </w:rPr>
+      </w:pPr>
+      <w:r>
+        <w:rPr>
+          <w:color w:val="auto"/>
+        </w:rPr>
+        <w:t xml:space="preserve">    </w:t>
+      </w:r>
+      <w:r>
+        <w:rPr>
+          <w:color w:val="auto"/>
+        </w:rPr>
+        <w:t>linestyle="--",</w:t>
+      </w:r>
+    </w:p>
+    <w:p>
+      <w:pPr>
+        <w:pStyle w:val="Code"/>
+        <w:rPr>
+          <w:color w:val="auto"/>
+        </w:rPr>
+      </w:pPr>
+      <w:r>
+        <w:rPr>
+          <w:color w:val="auto"/>
+        </w:rPr>
+        <w:t xml:space="preserve">    </w:t>
+      </w:r>
+      <w:r>
+        <w:rPr>
+          <w:color w:val="auto"/>
+        </w:rPr>
+        <w:t>label=f"Поріг Y (alpha={alpha_threshold:.3f})",</w:t>
+      </w:r>
+    </w:p>
+    <w:p>
+      <w:pPr>
+        <w:pStyle w:val="Code"/>
+        <w:rPr>
+          <w:color w:val="auto"/>
+        </w:rPr>
+      </w:pPr>
+      <w:r>
+        <w:rPr>
+          <w:color w:val="auto"/>
+        </w:rPr>
+        <w:t>)</w:t>
+      </w:r>
+    </w:p>
+    <w:p>
+      <w:pPr>
+        <w:pStyle w:val="Code"/>
+        <w:rPr>
+          <w:color w:val="auto"/>
+        </w:rPr>
+      </w:pPr>
+      <w:r>
+        <w:rPr>
+          <w:color w:val="auto"/>
+        </w:rPr>
+        <w:t>plt.title(f"Поле кореляції (Варіант {VARIANT})")</w:t>
+      </w:r>
+    </w:p>
+    <w:p>
+      <w:pPr>
+        <w:pStyle w:val="Code"/>
+        <w:rPr>
+          <w:color w:val="auto"/>
+        </w:rPr>
+      </w:pPr>
+      <w:r>
+        <w:rPr>
+          <w:color w:val="auto"/>
+        </w:rPr>
+        <w:t>plt.xlabel("Напруга шуму Uш (Ознака X)")</w:t>
+      </w:r>
+    </w:p>
+    <w:p>
+      <w:pPr>
+        <w:pStyle w:val="Code"/>
+        <w:rPr>
+          <w:color w:val="auto"/>
+        </w:rPr>
+      </w:pPr>
+      <w:r>
+        <w:rPr>
+          <w:color w:val="auto"/>
+        </w:rPr>
+        <w:t>plt.ylabel("Коефіцієнт старіння alpha (Параметр Y)")</w:t>
+      </w:r>
+    </w:p>
+    <w:p>
+      <w:pPr>
+        <w:pStyle w:val="Code"/>
+        <w:rPr>
+          <w:color w:val="auto"/>
+        </w:rPr>
+      </w:pPr>
+      <w:r>
+        <w:rPr>
+          <w:color w:val="auto"/>
+        </w:rPr>
+        <w:t>plt.legend()</w:t>
+      </w:r>
+    </w:p>
+    <w:p>
+      <w:pPr>
+        <w:pStyle w:val="Code"/>
+        <w:rPr>
+          <w:color w:val="auto"/>
+        </w:rPr>
+      </w:pPr>
+      <w:r>
+        <w:rPr>
+          <w:color w:val="auto"/>
+        </w:rPr>
+        <w:t>plt.grid(True)</w:t>
+      </w:r>
+    </w:p>
+    <w:p>
+      <w:pPr>
+        <w:pStyle w:val="Code"/>
+        <w:rPr>
+          <w:color w:val="auto"/>
+        </w:rPr>
+      </w:pPr>
+      <w:r>
+        <w:rPr>
+          <w:color w:val="auto"/>
+        </w:rPr>
+        <w:t>plt.show()</w:t>
+      </w:r>
+    </w:p>
+    <w:p>
+      <w:pPr>
+        <w:pStyle w:val="Code"/>
+        <w:rPr>
+          <w:color w:val="auto"/>
+        </w:rPr>
+      </w:pPr>
+      <w:r>
+        <w:rPr>
+          <w:color w:val="auto"/>
+        </w:rPr>
+      </w:r>
+    </w:p>
+    <w:p>
+      <w:pPr>
+        <w:pStyle w:val="Code"/>
+        <w:rPr>
+          <w:color w:val="auto"/>
+        </w:rPr>
+      </w:pPr>
+      <w:r>
+        <w:rPr>
+          <w:color w:val="auto"/>
+        </w:rPr>
+        <w:t># ==========================================</w:t>
+      </w:r>
+    </w:p>
+    <w:p>
+      <w:pPr>
+        <w:pStyle w:val="Code"/>
+        <w:rPr>
+          <w:color w:val="auto"/>
+        </w:rPr>
+      </w:pPr>
+      <w:r>
+        <w:rPr>
+          <w:color w:val="auto"/>
+        </w:rPr>
+        <w:t># 4. РОЗРАХУНОК ЙМОВІРНОСТЕЙ ДЛЯ РІЗНИХ ПОРОГІВ X (п. 1.3.4 - 1.3.8)</w:t>
+      </w:r>
+    </w:p>
+    <w:p>
+      <w:pPr>
+        <w:pStyle w:val="Code"/>
+        <w:rPr>
+          <w:color w:val="auto"/>
+        </w:rPr>
+      </w:pPr>
+      <w:r>
+        <w:rPr>
+          <w:color w:val="auto"/>
+        </w:rPr>
+        <w:t># ==========================================</w:t>
+      </w:r>
+    </w:p>
+    <w:p>
+      <w:pPr>
+        <w:pStyle w:val="Code"/>
+        <w:rPr>
+          <w:color w:val="auto"/>
+        </w:rPr>
+      </w:pPr>
+      <w:r>
+        <w:rPr>
+          <w:color w:val="auto"/>
+        </w:rPr>
+        <w:t>results = []</w:t>
+      </w:r>
+    </w:p>
+    <w:p>
+      <w:pPr>
+        <w:pStyle w:val="Code"/>
+        <w:rPr>
+          <w:color w:val="auto"/>
+        </w:rPr>
+      </w:pPr>
+      <w:r>
+        <w:rPr>
+          <w:color w:val="auto"/>
+        </w:rPr>
+      </w:r>
+    </w:p>
+    <w:p>
+      <w:pPr>
+        <w:pStyle w:val="Code"/>
+        <w:rPr>
+          <w:color w:val="auto"/>
+        </w:rPr>
+      </w:pPr>
+      <w:r>
+        <w:rPr>
+          <w:color w:val="auto"/>
+        </w:rPr>
+        <w:t># Сортуємо унікальні значення U_sh, щоб використовувати їх як пороги</w:t>
+      </w:r>
+    </w:p>
+    <w:p>
+      <w:pPr>
+        <w:pStyle w:val="Code"/>
+        <w:rPr>
+          <w:color w:val="auto"/>
+        </w:rPr>
+      </w:pPr>
+      <w:r>
+        <w:rPr>
+          <w:color w:val="auto"/>
+        </w:rPr>
+        <w:t>thresholds = sorted(df["U_sh"].unique())</w:t>
+      </w:r>
+    </w:p>
+    <w:p>
+      <w:pPr>
+        <w:pStyle w:val="Code"/>
+        <w:rPr>
+          <w:color w:val="auto"/>
+        </w:rPr>
+      </w:pPr>
+      <w:r>
+        <w:rPr>
+          <w:color w:val="auto"/>
+        </w:rPr>
+        <w:t>total_N = len(df)</w:t>
+      </w:r>
+    </w:p>
+    <w:p>
+      <w:pPr>
+        <w:pStyle w:val="Code"/>
+        <w:rPr>
+          <w:color w:val="auto"/>
+        </w:rPr>
+      </w:pPr>
+      <w:r>
+        <w:rPr>
+          <w:color w:val="auto"/>
+        </w:rPr>
+      </w:r>
+    </w:p>
+    <w:p>
+      <w:pPr>
+        <w:pStyle w:val="Code"/>
+        <w:rPr>
+          <w:color w:val="auto"/>
+        </w:rPr>
+      </w:pPr>
+      <w:r>
+        <w:rPr>
+          <w:color w:val="auto"/>
+        </w:rPr>
+        <w:t>for X_kl in thresholds:</w:t>
+      </w:r>
+    </w:p>
+    <w:p>
+      <w:pPr>
+        <w:pStyle w:val="Code"/>
+        <w:rPr>
+          <w:color w:val="auto"/>
+        </w:rPr>
+      </w:pPr>
+      <w:r>
+        <w:rPr>
+          <w:color w:val="auto"/>
+        </w:rPr>
+        <w:t xml:space="preserve">    </w:t>
+      </w:r>
+      <w:r>
+        <w:rPr>
+          <w:color w:val="auto"/>
+        </w:rPr>
+        <w:t># Приймаємо рішення:</w:t>
+      </w:r>
+    </w:p>
+    <w:p>
+      <w:pPr>
+        <w:pStyle w:val="Code"/>
+        <w:rPr>
+          <w:color w:val="auto"/>
+        </w:rPr>
+      </w:pPr>
+      <w:r>
+        <w:rPr>
+          <w:color w:val="auto"/>
+        </w:rPr>
+        <w:t xml:space="preserve">    </w:t>
+      </w:r>
+      <w:r>
+        <w:rPr>
+          <w:color w:val="auto"/>
+        </w:rPr>
+        <w:t># Якщо U_sh &lt;= X_kl -&gt; Вирішуємо K1</w:t>
+      </w:r>
+    </w:p>
+    <w:p>
+      <w:pPr>
+        <w:pStyle w:val="Code"/>
+        <w:rPr>
+          <w:color w:val="auto"/>
+        </w:rPr>
+      </w:pPr>
+      <w:r>
+        <w:rPr>
+          <w:color w:val="auto"/>
+        </w:rPr>
+        <w:t xml:space="preserve">    </w:t>
+      </w:r>
+      <w:r>
+        <w:rPr>
+          <w:color w:val="auto"/>
+        </w:rPr>
+        <w:t># Якщо U_sh &gt; X_kl  -&gt; Вирішуємо K2</w:t>
+      </w:r>
+    </w:p>
+    <w:p>
+      <w:pPr>
+        <w:pStyle w:val="Code"/>
+        <w:rPr>
+          <w:color w:val="auto"/>
+        </w:rPr>
+      </w:pPr>
+      <w:r>
+        <w:rPr>
+          <w:color w:val="auto"/>
+        </w:rPr>
+      </w:r>
+    </w:p>
+    <w:p>
+      <w:pPr>
+        <w:pStyle w:val="Code"/>
+        <w:rPr>
+          <w:color w:val="auto"/>
+        </w:rPr>
+      </w:pPr>
+      <w:r>
+        <w:rPr>
+          <w:color w:val="auto"/>
+        </w:rPr>
+        <w:t xml:space="preserve">    </w:t>
+      </w:r>
+      <w:r>
+        <w:rPr>
+          <w:color w:val="auto"/>
+        </w:rPr>
+        <w:t># n(ріш К1 / К1) - True Positive (для К1)</w:t>
+      </w:r>
+    </w:p>
+    <w:p>
+      <w:pPr>
+        <w:pStyle w:val="Code"/>
+        <w:rPr>
+          <w:color w:val="auto"/>
+        </w:rPr>
+      </w:pPr>
+      <w:r>
+        <w:rPr>
+          <w:color w:val="auto"/>
+        </w:rPr>
+        <w:t xml:space="preserve">    </w:t>
+      </w:r>
+      <w:r>
+        <w:rPr>
+          <w:color w:val="auto"/>
+        </w:rPr>
+        <w:t>n_rK1_K1 = len(df[(df["U_sh"] &lt;= X_kl) &amp; (df["True_Class"] == "K1")])</w:t>
+      </w:r>
+    </w:p>
+    <w:p>
+      <w:pPr>
+        <w:pStyle w:val="Code"/>
+        <w:rPr>
+          <w:color w:val="auto"/>
+        </w:rPr>
+      </w:pPr>
+      <w:r>
+        <w:rPr>
+          <w:color w:val="auto"/>
+        </w:rPr>
+      </w:r>
+    </w:p>
+    <w:p>
+      <w:pPr>
+        <w:pStyle w:val="Code"/>
+        <w:rPr>
+          <w:color w:val="auto"/>
+        </w:rPr>
+      </w:pPr>
+      <w:r>
+        <w:rPr>
+          <w:color w:val="auto"/>
+        </w:rPr>
+        <w:t xml:space="preserve">    </w:t>
+      </w:r>
+      <w:r>
+        <w:rPr>
+          <w:color w:val="auto"/>
+        </w:rPr>
+        <w:t># n(ріш К2 / К2) - True Negative</w:t>
+      </w:r>
+    </w:p>
+    <w:p>
+      <w:pPr>
+        <w:pStyle w:val="Code"/>
+        <w:rPr>
+          <w:color w:val="auto"/>
+        </w:rPr>
+      </w:pPr>
+      <w:r>
+        <w:rPr>
+          <w:color w:val="auto"/>
+        </w:rPr>
+        <w:t xml:space="preserve">    </w:t>
+      </w:r>
+      <w:r>
+        <w:rPr>
+          <w:color w:val="auto"/>
+        </w:rPr>
+        <w:t>n_rK2_K2 = len(df[(df["U_sh"] &gt; X_kl) &amp; (df["True_Class"] == "K2")])</w:t>
+      </w:r>
+    </w:p>
+    <w:p>
+      <w:pPr>
+        <w:pStyle w:val="Code"/>
+        <w:rPr>
+          <w:color w:val="auto"/>
+        </w:rPr>
+      </w:pPr>
+      <w:r>
+        <w:rPr>
+          <w:color w:val="auto"/>
+        </w:rPr>
+      </w:r>
+    </w:p>
+    <w:p>
+      <w:pPr>
+        <w:pStyle w:val="Code"/>
+        <w:rPr>
+          <w:color w:val="auto"/>
+        </w:rPr>
+      </w:pPr>
+      <w:r>
+        <w:rPr>
+          <w:color w:val="auto"/>
+        </w:rPr>
+        <w:t xml:space="preserve">    </w:t>
+      </w:r>
+      <w:r>
+        <w:rPr>
+          <w:color w:val="auto"/>
+        </w:rPr>
+        <w:t># n(ріш К1 / К2) - Помилка: Вирішили К1, а насправді К2 (Пропуск браку)</w:t>
+      </w:r>
+    </w:p>
+    <w:p>
+      <w:pPr>
+        <w:pStyle w:val="Code"/>
+        <w:rPr>
+          <w:color w:val="auto"/>
+        </w:rPr>
+      </w:pPr>
+      <w:r>
+        <w:rPr>
+          <w:color w:val="auto"/>
+        </w:rPr>
+        <w:t xml:space="preserve">    </w:t>
+      </w:r>
+      <w:r>
+        <w:rPr>
+          <w:color w:val="auto"/>
+        </w:rPr>
+        <w:t>n_rK1_K2 = len(df[(df["U_sh"] &lt;= X_kl) &amp; (df["True_Class"] == "K2")])</w:t>
+      </w:r>
+    </w:p>
+    <w:p>
+      <w:pPr>
+        <w:pStyle w:val="Code"/>
+        <w:rPr>
+          <w:color w:val="auto"/>
+        </w:rPr>
+      </w:pPr>
+      <w:r>
+        <w:rPr>
+          <w:color w:val="auto"/>
+        </w:rPr>
+      </w:r>
+    </w:p>
+    <w:p>
+      <w:pPr>
+        <w:pStyle w:val="Code"/>
+        <w:rPr>
+          <w:color w:val="auto"/>
+        </w:rPr>
+      </w:pPr>
+      <w:r>
+        <w:rPr>
+          <w:color w:val="auto"/>
+        </w:rPr>
+        <w:t xml:space="preserve">    </w:t>
+      </w:r>
+      <w:r>
+        <w:rPr>
+          <w:color w:val="auto"/>
+        </w:rPr>
+        <w:t># n(ріш К2 / К1) - Помилка: Вирішили К2, а насправді К1 (Хибна тривога)</w:t>
+      </w:r>
+    </w:p>
+    <w:p>
+      <w:pPr>
+        <w:pStyle w:val="Code"/>
+        <w:rPr>
+          <w:color w:val="auto"/>
+        </w:rPr>
+      </w:pPr>
+      <w:r>
+        <w:rPr>
+          <w:color w:val="auto"/>
+        </w:rPr>
+        <w:t xml:space="preserve">    </w:t>
+      </w:r>
+      <w:r>
+        <w:rPr>
+          <w:color w:val="auto"/>
+        </w:rPr>
+        <w:t>n_rK2_K1 = len(df[(df["U_sh"] &gt; X_kl) &amp; (df["True_Class"] == "K1")])</w:t>
+      </w:r>
+    </w:p>
+    <w:p>
+      <w:pPr>
+        <w:pStyle w:val="Code"/>
+        <w:rPr>
+          <w:color w:val="auto"/>
+        </w:rPr>
+      </w:pPr>
+      <w:r>
+        <w:rPr>
+          <w:color w:val="auto"/>
+        </w:rPr>
+      </w:r>
+    </w:p>
+    <w:p>
+      <w:pPr>
+        <w:pStyle w:val="Code"/>
+        <w:rPr>
+          <w:color w:val="auto"/>
+        </w:rPr>
+      </w:pPr>
+      <w:r>
+        <w:rPr>
+          <w:color w:val="auto"/>
+        </w:rPr>
+        <w:t xml:space="preserve">    </w:t>
+      </w:r>
+      <w:r>
+        <w:rPr>
+          <w:color w:val="auto"/>
+        </w:rPr>
+        <w:t># Загальне число рішень</w:t>
+      </w:r>
+    </w:p>
+    <w:p>
+      <w:pPr>
+        <w:pStyle w:val="Code"/>
+        <w:rPr>
+          <w:color w:val="auto"/>
+        </w:rPr>
+      </w:pPr>
+      <w:r>
+        <w:rPr>
+          <w:color w:val="auto"/>
+        </w:rPr>
+        <w:t xml:space="preserve">    </w:t>
+      </w:r>
+      <w:r>
+        <w:rPr>
+          <w:color w:val="auto"/>
+        </w:rPr>
+        <w:t>n_rK1 = n_rK1_K1 + n_rK1_K2</w:t>
+      </w:r>
+    </w:p>
+    <w:p>
+      <w:pPr>
+        <w:pStyle w:val="Code"/>
+        <w:rPr>
+          <w:color w:val="auto"/>
+        </w:rPr>
+      </w:pPr>
+      <w:r>
+        <w:rPr>
+          <w:color w:val="auto"/>
+        </w:rPr>
+        <w:t xml:space="preserve">    </w:t>
+      </w:r>
+      <w:r>
+        <w:rPr>
+          <w:color w:val="auto"/>
+        </w:rPr>
+        <w:t>n_rK2 = n_rK2_K1 + n_rK2_K2</w:t>
+      </w:r>
+    </w:p>
+    <w:p>
+      <w:pPr>
+        <w:pStyle w:val="Code"/>
+        <w:rPr>
+          <w:color w:val="auto"/>
+        </w:rPr>
+      </w:pPr>
+      <w:r>
+        <w:rPr>
+          <w:color w:val="auto"/>
+        </w:rPr>
+      </w:r>
+    </w:p>
+    <w:p>
+      <w:pPr>
+        <w:pStyle w:val="Code"/>
+        <w:rPr>
+          <w:color w:val="auto"/>
+        </w:rPr>
+      </w:pPr>
+      <w:r>
+        <w:rPr>
+          <w:color w:val="auto"/>
+        </w:rPr>
+        <w:t xml:space="preserve">    </w:t>
+      </w:r>
+      <w:r>
+        <w:rPr>
+          <w:color w:val="auto"/>
+        </w:rPr>
+        <w:t># Ймовірності (п. 1.3.7)</w:t>
+      </w:r>
+    </w:p>
+    <w:p>
+      <w:pPr>
+        <w:pStyle w:val="Code"/>
+        <w:rPr>
+          <w:color w:val="auto"/>
+        </w:rPr>
+      </w:pPr>
+      <w:r>
+        <w:rPr>
+          <w:color w:val="auto"/>
+        </w:rPr>
+        <w:t xml:space="preserve">    </w:t>
+      </w:r>
+      <w:r>
+        <w:rPr>
+          <w:color w:val="auto"/>
+        </w:rPr>
+        <w:t># P_pom (Ймовірність помилки) = (Помилкові рішення) / N</w:t>
+      </w:r>
+    </w:p>
+    <w:p>
+      <w:pPr>
+        <w:pStyle w:val="Code"/>
+        <w:rPr>
+          <w:color w:val="auto"/>
+        </w:rPr>
+      </w:pPr>
+      <w:r>
+        <w:rPr>
+          <w:color w:val="auto"/>
+        </w:rPr>
+        <w:t xml:space="preserve">    </w:t>
+      </w:r>
+      <w:r>
+        <w:rPr>
+          <w:color w:val="auto"/>
+        </w:rPr>
+        <w:t>P_pom = (n_rK1_K2 + n_rK2_K1) / total_N</w:t>
+      </w:r>
+    </w:p>
+    <w:p>
+      <w:pPr>
+        <w:pStyle w:val="Code"/>
+        <w:rPr>
+          <w:color w:val="auto"/>
+        </w:rPr>
+      </w:pPr>
+      <w:r>
+        <w:rPr>
+          <w:color w:val="auto"/>
+        </w:rPr>
+        <w:t xml:space="preserve">    </w:t>
+      </w:r>
+      <w:r>
+        <w:rPr>
+          <w:color w:val="auto"/>
+        </w:rPr>
+        <w:t>P_prav = 1 - P_pom</w:t>
+      </w:r>
+    </w:p>
+    <w:p>
+      <w:pPr>
+        <w:pStyle w:val="Code"/>
+        <w:rPr>
+          <w:color w:val="auto"/>
+        </w:rPr>
+      </w:pPr>
+      <w:r>
+        <w:rPr>
+          <w:color w:val="auto"/>
+        </w:rPr>
+      </w:r>
+    </w:p>
+    <w:p>
+      <w:pPr>
+        <w:pStyle w:val="Code"/>
+        <w:rPr>
+          <w:color w:val="auto"/>
+        </w:rPr>
+      </w:pPr>
+      <w:r>
+        <w:rPr>
+          <w:color w:val="auto"/>
+        </w:rPr>
+        <w:t xml:space="preserve">    </w:t>
+      </w:r>
+      <w:r>
+        <w:rPr>
+          <w:color w:val="auto"/>
+        </w:rPr>
+        <w:t>results.append(</w:t>
+      </w:r>
+    </w:p>
+    <w:p>
+      <w:pPr>
+        <w:pStyle w:val="Code"/>
+        <w:rPr>
+          <w:color w:val="auto"/>
+        </w:rPr>
+      </w:pPr>
+      <w:r>
+        <w:rPr>
+          <w:color w:val="auto"/>
+        </w:rPr>
+        <w:t xml:space="preserve">        </w:t>
+      </w:r>
+      <w:r>
+        <w:rPr>
+          <w:color w:val="auto"/>
+        </w:rPr>
+        <w:t>{</w:t>
+      </w:r>
+    </w:p>
+    <w:p>
+      <w:pPr>
+        <w:pStyle w:val="Code"/>
+        <w:rPr>
+          <w:color w:val="auto"/>
+        </w:rPr>
+      </w:pPr>
+      <w:r>
+        <w:rPr>
+          <w:color w:val="auto"/>
+        </w:rPr>
+        <w:t xml:space="preserve">            </w:t>
+      </w:r>
+      <w:r>
+        <w:rPr>
+          <w:color w:val="auto"/>
+        </w:rPr>
+        <w:t>"X_kl": X_kl,</w:t>
+      </w:r>
+    </w:p>
+    <w:p>
+      <w:pPr>
+        <w:pStyle w:val="Code"/>
+        <w:rPr>
+          <w:color w:val="auto"/>
+        </w:rPr>
+      </w:pPr>
+      <w:r>
+        <w:rPr>
+          <w:color w:val="auto"/>
+        </w:rPr>
+        <w:t xml:space="preserve">            </w:t>
+      </w:r>
+      <w:r>
+        <w:rPr>
+          <w:color w:val="auto"/>
+        </w:rPr>
+        <w:t>"n(rK1/K1)": n_rK1_K1,</w:t>
+      </w:r>
+    </w:p>
+    <w:p>
+      <w:pPr>
+        <w:pStyle w:val="Code"/>
+        <w:rPr>
+          <w:color w:val="auto"/>
+        </w:rPr>
+      </w:pPr>
+      <w:r>
+        <w:rPr>
+          <w:color w:val="auto"/>
+        </w:rPr>
+        <w:t xml:space="preserve">            </w:t>
+      </w:r>
+      <w:r>
+        <w:rPr>
+          <w:color w:val="auto"/>
+        </w:rPr>
+        <w:t>"n(rK2/K2)": n_rK2_K2,</w:t>
+      </w:r>
+    </w:p>
+    <w:p>
+      <w:pPr>
+        <w:pStyle w:val="Code"/>
+        <w:rPr>
+          <w:color w:val="auto"/>
+        </w:rPr>
+      </w:pPr>
+      <w:r>
+        <w:rPr>
+          <w:color w:val="auto"/>
+        </w:rPr>
+        <w:t xml:space="preserve">            </w:t>
+      </w:r>
+      <w:r>
+        <w:rPr>
+          <w:color w:val="auto"/>
+        </w:rPr>
+        <w:t>"n(rK1/K2)": n_rK1_K2,  # Помилка пропуску</w:t>
+      </w:r>
+    </w:p>
+    <w:p>
+      <w:pPr>
+        <w:pStyle w:val="Code"/>
+        <w:rPr>
+          <w:color w:val="auto"/>
+        </w:rPr>
+      </w:pPr>
+      <w:r>
+        <w:rPr>
+          <w:color w:val="auto"/>
+        </w:rPr>
+        <w:t xml:space="preserve">            </w:t>
+      </w:r>
+      <w:r>
+        <w:rPr>
+          <w:color w:val="auto"/>
+        </w:rPr>
+        <w:t>"n(rK2/K1)": n_rK2_K1,  # Помилка хибної тривоги</w:t>
+      </w:r>
+    </w:p>
+    <w:p>
+      <w:pPr>
+        <w:pStyle w:val="Code"/>
+        <w:rPr>
+          <w:color w:val="auto"/>
+        </w:rPr>
+      </w:pPr>
+      <w:r>
+        <w:rPr>
+          <w:color w:val="auto"/>
+        </w:rPr>
+        <w:t xml:space="preserve">            </w:t>
+      </w:r>
+      <w:r>
+        <w:rPr>
+          <w:color w:val="auto"/>
+        </w:rPr>
+        <w:t>"n(rK1)": n_rK1,</w:t>
+      </w:r>
+    </w:p>
+    <w:p>
+      <w:pPr>
+        <w:pStyle w:val="Code"/>
+        <w:rPr>
+          <w:color w:val="auto"/>
+        </w:rPr>
+      </w:pPr>
+      <w:r>
+        <w:rPr>
+          <w:color w:val="auto"/>
+        </w:rPr>
+        <w:t xml:space="preserve">            </w:t>
+      </w:r>
+      <w:r>
+        <w:rPr>
+          <w:color w:val="auto"/>
+        </w:rPr>
+        <w:t>"n(rK2)": n_rK2,</w:t>
+      </w:r>
+    </w:p>
+    <w:p>
+      <w:pPr>
+        <w:pStyle w:val="Code"/>
+        <w:rPr>
+          <w:color w:val="auto"/>
+        </w:rPr>
+      </w:pPr>
+      <w:r>
+        <w:rPr>
+          <w:color w:val="auto"/>
+        </w:rPr>
+        <w:t xml:space="preserve">            </w:t>
+      </w:r>
+      <w:r>
+        <w:rPr>
+          <w:color w:val="auto"/>
+        </w:rPr>
+        <w:t>"P_pom": P_pom,</w:t>
+      </w:r>
+    </w:p>
+    <w:p>
+      <w:pPr>
+        <w:pStyle w:val="Code"/>
+        <w:rPr>
+          <w:color w:val="auto"/>
+        </w:rPr>
+      </w:pPr>
+      <w:r>
+        <w:rPr>
+          <w:color w:val="auto"/>
+        </w:rPr>
+        <w:t xml:space="preserve">            </w:t>
+      </w:r>
+      <w:r>
+        <w:rPr>
+          <w:color w:val="auto"/>
+        </w:rPr>
+        <w:t>"P_prav": P_prav,</w:t>
+      </w:r>
+    </w:p>
+    <w:p>
+      <w:pPr>
+        <w:pStyle w:val="Code"/>
+        <w:rPr>
+          <w:color w:val="auto"/>
+        </w:rPr>
+      </w:pPr>
+      <w:r>
+        <w:rPr>
+          <w:color w:val="auto"/>
+        </w:rPr>
+        <w:t xml:space="preserve">        </w:t>
+      </w:r>
+      <w:r>
+        <w:rPr>
+          <w:color w:val="auto"/>
+        </w:rPr>
+        <w:t>}</w:t>
+      </w:r>
+    </w:p>
+    <w:p>
+      <w:pPr>
+        <w:pStyle w:val="Code"/>
+        <w:rPr>
+          <w:color w:val="auto"/>
+        </w:rPr>
+      </w:pPr>
+      <w:r>
+        <w:rPr>
+          <w:color w:val="auto"/>
+        </w:rPr>
+        <w:t xml:space="preserve">    </w:t>
+      </w:r>
+      <w:r>
+        <w:rPr>
+          <w:color w:val="auto"/>
+        </w:rPr>
+        <w:t>)</w:t>
+      </w:r>
+    </w:p>
+    <w:p>
+      <w:pPr>
+        <w:pStyle w:val="Code"/>
+        <w:rPr>
+          <w:color w:val="auto"/>
+        </w:rPr>
+      </w:pPr>
+      <w:r>
+        <w:rPr>
+          <w:color w:val="auto"/>
+        </w:rPr>
+      </w:r>
+    </w:p>
+    <w:p>
+      <w:pPr>
+        <w:pStyle w:val="Code"/>
+        <w:rPr>
+          <w:color w:val="auto"/>
+        </w:rPr>
+      </w:pPr>
+      <w:r>
+        <w:rPr>
+          <w:color w:val="auto"/>
+        </w:rPr>
+        <w:t>results_df = pd.DataFrame(results)</w:t>
+      </w:r>
+    </w:p>
+    <w:p>
+      <w:pPr>
+        <w:pStyle w:val="Code"/>
+        <w:rPr>
+          <w:color w:val="auto"/>
+        </w:rPr>
+      </w:pPr>
+      <w:r>
+        <w:rPr>
+          <w:color w:val="auto"/>
+        </w:rPr>
+      </w:r>
+    </w:p>
+    <w:p>
+      <w:pPr>
+        <w:pStyle w:val="Code"/>
+        <w:rPr>
+          <w:color w:val="auto"/>
+        </w:rPr>
+      </w:pPr>
+      <w:r>
+        <w:rPr>
+          <w:color w:val="auto"/>
+        </w:rPr>
+        <w:t># Відображення таблиці (перші та останні рядки, та область мінімуму помилки)</w:t>
+      </w:r>
+    </w:p>
+    <w:p>
+      <w:pPr>
+        <w:pStyle w:val="Code"/>
+        <w:rPr>
+          <w:color w:val="auto"/>
+        </w:rPr>
+      </w:pPr>
+      <w:r>
+        <w:rPr>
+          <w:color w:val="auto"/>
+        </w:rPr>
+        <w:t>print("\nТаблиця результатів (фрагмент):")</w:t>
+      </w:r>
+    </w:p>
+    <w:p>
+      <w:pPr>
+        <w:pStyle w:val="Code"/>
+        <w:rPr>
+          <w:color w:val="auto"/>
+        </w:rPr>
+      </w:pPr>
+      <w:r>
+        <w:rPr>
+          <w:color w:val="auto"/>
+        </w:rPr>
+        <w:t>print(results_df)</w:t>
+      </w:r>
+    </w:p>
+    <w:p>
+      <w:pPr>
+        <w:pStyle w:val="Code"/>
+        <w:rPr>
+          <w:color w:val="auto"/>
+        </w:rPr>
+      </w:pPr>
+      <w:r>
+        <w:rPr>
+          <w:color w:val="auto"/>
+        </w:rPr>
+      </w:r>
+    </w:p>
+    <w:p>
+      <w:pPr>
+        <w:pStyle w:val="Code"/>
+        <w:rPr>
+          <w:color w:val="auto"/>
+        </w:rPr>
+      </w:pPr>
+      <w:r>
+        <w:rPr>
+          <w:color w:val="auto"/>
+        </w:rPr>
+        <w:t># ==========================================</w:t>
+      </w:r>
+    </w:p>
+    <w:p>
+      <w:pPr>
+        <w:pStyle w:val="Code"/>
+        <w:rPr>
+          <w:color w:val="auto"/>
+        </w:rPr>
+      </w:pPr>
+      <w:r>
+        <w:rPr>
+          <w:color w:val="auto"/>
+        </w:rPr>
+        <w:t># 5. ГРАФІКИ ЗАЛЕЖНОСТІ ЙМОВІРНОСТЕЙ (п. 1.3.9)</w:t>
+      </w:r>
+    </w:p>
+    <w:p>
+      <w:pPr>
+        <w:pStyle w:val="Code"/>
+        <w:rPr>
+          <w:color w:val="auto"/>
+        </w:rPr>
+      </w:pPr>
+      <w:r>
+        <w:rPr>
+          <w:color w:val="auto"/>
+        </w:rPr>
+        <w:t># ==========================================</w:t>
+      </w:r>
+    </w:p>
+    <w:p>
+      <w:pPr>
+        <w:pStyle w:val="Code"/>
+        <w:rPr>
+          <w:color w:val="auto"/>
+        </w:rPr>
+      </w:pPr>
+      <w:r>
+        <w:rPr>
+          <w:color w:val="auto"/>
+        </w:rPr>
+        <w:t>plt.figure(figsize=(10, 6))</w:t>
+      </w:r>
+    </w:p>
+    <w:p>
+      <w:pPr>
+        <w:pStyle w:val="Code"/>
+        <w:rPr>
+          <w:color w:val="auto"/>
+        </w:rPr>
+      </w:pPr>
+      <w:r>
+        <w:rPr>
+          <w:color w:val="auto"/>
+        </w:rPr>
+        <w:t>plt.plot(</w:t>
+      </w:r>
+    </w:p>
+    <w:p>
+      <w:pPr>
+        <w:pStyle w:val="Code"/>
+        <w:rPr>
+          <w:color w:val="auto"/>
+        </w:rPr>
+      </w:pPr>
+      <w:r>
+        <w:rPr>
+          <w:color w:val="auto"/>
+        </w:rPr>
+        <w:t xml:space="preserve">    </w:t>
+      </w:r>
+      <w:r>
+        <w:rPr>
+          <w:color w:val="auto"/>
+        </w:rPr>
+        <w:t>results_df["X_kl"],</w:t>
+      </w:r>
+    </w:p>
+    <w:p>
+      <w:pPr>
+        <w:pStyle w:val="Code"/>
+        <w:rPr>
+          <w:color w:val="auto"/>
+        </w:rPr>
+      </w:pPr>
+      <w:r>
+        <w:rPr>
+          <w:color w:val="auto"/>
+        </w:rPr>
+        <w:t xml:space="preserve">    </w:t>
+      </w:r>
+      <w:r>
+        <w:rPr>
+          <w:color w:val="auto"/>
+        </w:rPr>
+        <w:t>results_df["P_pom"],</w:t>
+      </w:r>
+    </w:p>
+    <w:p>
+      <w:pPr>
+        <w:pStyle w:val="Code"/>
+        <w:rPr>
+          <w:color w:val="auto"/>
+        </w:rPr>
+      </w:pPr>
+      <w:r>
+        <w:rPr>
+          <w:color w:val="auto"/>
+        </w:rPr>
+        <w:t xml:space="preserve">    </w:t>
+      </w:r>
+      <w:r>
+        <w:rPr>
+          <w:color w:val="auto"/>
+        </w:rPr>
+        <w:t>label="P помилки (сумарна)",</w:t>
+      </w:r>
+    </w:p>
+    <w:p>
+      <w:pPr>
+        <w:pStyle w:val="Code"/>
+        <w:rPr>
+          <w:color w:val="auto"/>
+        </w:rPr>
+      </w:pPr>
+      <w:r>
+        <w:rPr>
+          <w:color w:val="auto"/>
+        </w:rPr>
+        <w:t xml:space="preserve">    </w:t>
+      </w:r>
+      <w:r>
+        <w:rPr>
+          <w:color w:val="auto"/>
+        </w:rPr>
+        <w:t>color="red",</w:t>
+      </w:r>
+    </w:p>
+    <w:p>
+      <w:pPr>
+        <w:pStyle w:val="Code"/>
+        <w:rPr>
+          <w:color w:val="auto"/>
+        </w:rPr>
+      </w:pPr>
+      <w:r>
+        <w:rPr>
+          <w:color w:val="auto"/>
+        </w:rPr>
+        <w:t xml:space="preserve">    </w:t>
+      </w:r>
+      <w:r>
+        <w:rPr>
+          <w:color w:val="auto"/>
+        </w:rPr>
+        <w:t>linewidth=2,</w:t>
+      </w:r>
+    </w:p>
+    <w:p>
+      <w:pPr>
+        <w:pStyle w:val="Code"/>
+        <w:rPr>
+          <w:color w:val="auto"/>
+        </w:rPr>
+      </w:pPr>
+      <w:r>
+        <w:rPr>
+          <w:color w:val="auto"/>
+        </w:rPr>
+        <w:t>)</w:t>
+      </w:r>
+    </w:p>
+    <w:p>
+      <w:pPr>
+        <w:pStyle w:val="Code"/>
+        <w:rPr>
+          <w:color w:val="auto"/>
+        </w:rPr>
+      </w:pPr>
+      <w:r>
+        <w:rPr>
+          <w:color w:val="auto"/>
+        </w:rPr>
+        <w:t>plt.plot(</w:t>
+      </w:r>
+    </w:p>
+    <w:p>
+      <w:pPr>
+        <w:pStyle w:val="Code"/>
+        <w:rPr>
+          <w:color w:val="auto"/>
+        </w:rPr>
+      </w:pPr>
+      <w:r>
+        <w:rPr>
+          <w:color w:val="auto"/>
+        </w:rPr>
+        <w:t xml:space="preserve">    </w:t>
+      </w:r>
+      <w:r>
+        <w:rPr>
+          <w:color w:val="auto"/>
+        </w:rPr>
+        <w:t>results_df["X_kl"],</w:t>
+      </w:r>
+    </w:p>
+    <w:p>
+      <w:pPr>
+        <w:pStyle w:val="Code"/>
+        <w:rPr>
+          <w:color w:val="auto"/>
+        </w:rPr>
+      </w:pPr>
+      <w:r>
+        <w:rPr>
+          <w:color w:val="auto"/>
+        </w:rPr>
+        <w:t xml:space="preserve">    </w:t>
+      </w:r>
+      <w:r>
+        <w:rPr>
+          <w:color w:val="auto"/>
+        </w:rPr>
+        <w:t>results_df["P_prav"],</w:t>
+      </w:r>
+    </w:p>
+    <w:p>
+      <w:pPr>
+        <w:pStyle w:val="Code"/>
+        <w:rPr>
+          <w:color w:val="auto"/>
+        </w:rPr>
+      </w:pPr>
+      <w:r>
+        <w:rPr>
+          <w:color w:val="auto"/>
+        </w:rPr>
+        <w:t xml:space="preserve">    </w:t>
+      </w:r>
+      <w:r>
+        <w:rPr>
+          <w:color w:val="auto"/>
+        </w:rPr>
+        <w:t>label="P правильних рішень",</w:t>
+      </w:r>
+    </w:p>
+    <w:p>
+      <w:pPr>
+        <w:pStyle w:val="Code"/>
+        <w:rPr>
+          <w:color w:val="auto"/>
+        </w:rPr>
+      </w:pPr>
+      <w:r>
+        <w:rPr>
+          <w:color w:val="auto"/>
+        </w:rPr>
+        <w:t xml:space="preserve">    </w:t>
+      </w:r>
+      <w:r>
+        <w:rPr>
+          <w:color w:val="auto"/>
+        </w:rPr>
+        <w:t>color="green",</w:t>
+      </w:r>
+    </w:p>
+    <w:p>
+      <w:pPr>
+        <w:pStyle w:val="Code"/>
+        <w:rPr>
+          <w:color w:val="auto"/>
+        </w:rPr>
+      </w:pPr>
+      <w:r>
+        <w:rPr>
+          <w:color w:val="auto"/>
+        </w:rPr>
+        <w:t xml:space="preserve">    </w:t>
+      </w:r>
+      <w:r>
+        <w:rPr>
+          <w:color w:val="auto"/>
+        </w:rPr>
+        <w:t>linewidth=2,</w:t>
+      </w:r>
+    </w:p>
+    <w:p>
+      <w:pPr>
+        <w:pStyle w:val="Code"/>
+        <w:rPr>
+          <w:color w:val="auto"/>
+        </w:rPr>
+      </w:pPr>
+      <w:r>
+        <w:rPr>
+          <w:color w:val="auto"/>
+        </w:rPr>
+        <w:t>)</w:t>
+      </w:r>
+    </w:p>
+    <w:p>
+      <w:pPr>
+        <w:pStyle w:val="Code"/>
+        <w:rPr>
+          <w:color w:val="auto"/>
+        </w:rPr>
+      </w:pPr>
+      <w:r>
+        <w:rPr>
+          <w:color w:val="auto"/>
+        </w:rPr>
+      </w:r>
+    </w:p>
+    <w:p>
+      <w:pPr>
+        <w:pStyle w:val="Code"/>
+        <w:rPr>
+          <w:color w:val="auto"/>
+        </w:rPr>
+      </w:pPr>
+      <w:r>
+        <w:rPr>
+          <w:color w:val="auto"/>
+        </w:rPr>
+        <w:t># Знаходимо оптимальне значення (п. 1.3.10)</w:t>
+      </w:r>
+    </w:p>
+    <w:p>
+      <w:pPr>
+        <w:pStyle w:val="Code"/>
+        <w:rPr>
+          <w:color w:val="auto"/>
+        </w:rPr>
+      </w:pPr>
+      <w:r>
+        <w:rPr>
+          <w:color w:val="auto"/>
+        </w:rPr>
+        <w:t>best_row = results_df.loc[results_df["P_prav"].idxmax()]</w:t>
+      </w:r>
+    </w:p>
+    <w:p>
+      <w:pPr>
+        <w:pStyle w:val="Code"/>
+        <w:rPr>
+          <w:color w:val="auto"/>
+        </w:rPr>
+      </w:pPr>
+      <w:r>
+        <w:rPr>
+          <w:color w:val="auto"/>
+        </w:rPr>
+        <w:t>best_X = best_row["X_kl"]</w:t>
+      </w:r>
+    </w:p>
+    <w:p>
+      <w:pPr>
+        <w:pStyle w:val="Code"/>
+        <w:rPr>
+          <w:color w:val="auto"/>
+        </w:rPr>
+      </w:pPr>
+      <w:r>
+        <w:rPr>
+          <w:color w:val="auto"/>
+        </w:rPr>
+        <w:t>max_P = best_row["P_prav"]</w:t>
+      </w:r>
+    </w:p>
+    <w:p>
+      <w:pPr>
+        <w:pStyle w:val="Code"/>
+        <w:rPr>
+          <w:color w:val="auto"/>
+        </w:rPr>
+      </w:pPr>
+      <w:r>
+        <w:rPr>
+          <w:color w:val="auto"/>
+        </w:rPr>
+      </w:r>
+    </w:p>
+    <w:p>
+      <w:pPr>
+        <w:pStyle w:val="Code"/>
+        <w:rPr>
+          <w:color w:val="auto"/>
+        </w:rPr>
+      </w:pPr>
+      <w:r>
+        <w:rPr>
+          <w:color w:val="auto"/>
+        </w:rPr>
+        <w:t>plt.axvline(</w:t>
+      </w:r>
+    </w:p>
+    <w:p>
+      <w:pPr>
+        <w:pStyle w:val="Code"/>
+        <w:rPr>
+          <w:color w:val="auto"/>
+        </w:rPr>
+      </w:pPr>
+      <w:r>
+        <w:rPr>
+          <w:color w:val="auto"/>
+        </w:rPr>
+        <w:t xml:space="preserve">    </w:t>
+      </w:r>
+      <w:r>
+        <w:rPr>
+          <w:color w:val="auto"/>
+        </w:rPr>
+        <w:t>x=best_X, color="black", linestyle="--", label=f"Оптимальний поріг ({best_X})"</w:t>
+      </w:r>
+    </w:p>
+    <w:p>
+      <w:pPr>
+        <w:pStyle w:val="Code"/>
+        <w:rPr>
+          <w:color w:val="auto"/>
+        </w:rPr>
+      </w:pPr>
+      <w:r>
+        <w:rPr>
+          <w:color w:val="auto"/>
+        </w:rPr>
+        <w:t>)</w:t>
+      </w:r>
+    </w:p>
+    <w:p>
+      <w:pPr>
+        <w:pStyle w:val="Code"/>
+        <w:rPr>
+          <w:color w:val="auto"/>
+        </w:rPr>
+      </w:pPr>
+      <w:r>
+        <w:rPr>
+          <w:color w:val="auto"/>
+        </w:rPr>
+      </w:r>
+    </w:p>
+    <w:p>
+      <w:pPr>
+        <w:pStyle w:val="Code"/>
+        <w:rPr>
+          <w:color w:val="auto"/>
+        </w:rPr>
+      </w:pPr>
+      <w:r>
+        <w:rPr>
+          <w:color w:val="auto"/>
+        </w:rPr>
+        <w:t>plt.title("Залежність ймовірностей від порогу відсікання X_kl")</w:t>
+      </w:r>
+    </w:p>
+    <w:p>
+      <w:pPr>
+        <w:pStyle w:val="Code"/>
+        <w:rPr>
+          <w:color w:val="auto"/>
+        </w:rPr>
+      </w:pPr>
+      <w:r>
+        <w:rPr>
+          <w:color w:val="auto"/>
+        </w:rPr>
+        <w:t>plt.xlabel("Значення порогу напруги шуму X_kl")</w:t>
+      </w:r>
+    </w:p>
+    <w:p>
+      <w:pPr>
+        <w:pStyle w:val="Code"/>
+        <w:rPr>
+          <w:color w:val="auto"/>
+        </w:rPr>
+      </w:pPr>
+      <w:r>
+        <w:rPr>
+          <w:color w:val="auto"/>
+        </w:rPr>
+        <w:t>plt.ylabel("Ймовірність")</w:t>
+      </w:r>
+    </w:p>
+    <w:p>
+      <w:pPr>
+        <w:pStyle w:val="Code"/>
+        <w:rPr>
+          <w:color w:val="auto"/>
+        </w:rPr>
+      </w:pPr>
+      <w:r>
+        <w:rPr>
+          <w:color w:val="auto"/>
+        </w:rPr>
+        <w:t>plt.legend()</w:t>
+      </w:r>
+    </w:p>
+    <w:p>
+      <w:pPr>
+        <w:pStyle w:val="Code"/>
+        <w:rPr>
+          <w:color w:val="auto"/>
+        </w:rPr>
+      </w:pPr>
+      <w:r>
+        <w:rPr>
+          <w:color w:val="auto"/>
+        </w:rPr>
+        <w:t>plt.grid(True)</w:t>
+      </w:r>
+    </w:p>
+    <w:p>
+      <w:pPr>
+        <w:pStyle w:val="Code"/>
+        <w:rPr>
+          <w:color w:val="auto"/>
+        </w:rPr>
+      </w:pPr>
+      <w:r>
+        <w:rPr>
+          <w:color w:val="auto"/>
+        </w:rPr>
+        <w:t>plt.show()</w:t>
+      </w:r>
+    </w:p>
+    <w:p>
+      <w:pPr>
+        <w:pStyle w:val="Code"/>
+        <w:rPr>
+          <w:color w:val="auto"/>
+        </w:rPr>
+      </w:pPr>
+      <w:r>
+        <w:rPr>
+          <w:color w:val="auto"/>
+        </w:rPr>
+      </w:r>
+    </w:p>
+    <w:p>
+      <w:pPr>
+        <w:pStyle w:val="Code"/>
+        <w:rPr>
+          <w:color w:val="auto"/>
+        </w:rPr>
+      </w:pPr>
+      <w:r>
+        <w:rPr>
+          <w:color w:val="auto"/>
+        </w:rPr>
+        <w:t># ==========================================</w:t>
+      </w:r>
+    </w:p>
+    <w:p>
+      <w:pPr>
+        <w:pStyle w:val="Code"/>
+        <w:rPr>
+          <w:color w:val="auto"/>
+        </w:rPr>
+      </w:pPr>
+      <w:r>
+        <w:rPr>
+          <w:color w:val="auto"/>
+        </w:rPr>
+        <w:t># 6. АНАЛІЗ ТА ВИСНОВКИ (п. 1.3.10)</w:t>
+      </w:r>
+    </w:p>
+    <w:p>
+      <w:pPr>
+        <w:pStyle w:val="Code"/>
+        <w:rPr>
+          <w:color w:val="auto"/>
+        </w:rPr>
+      </w:pPr>
+      <w:r>
+        <w:rPr>
+          <w:color w:val="auto"/>
+        </w:rPr>
+        <w:t># ==========================================</w:t>
+      </w:r>
+    </w:p>
+    <w:p>
+      <w:pPr>
+        <w:pStyle w:val="Code"/>
+        <w:rPr>
+          <w:color w:val="auto"/>
+        </w:rPr>
+      </w:pPr>
+      <w:r>
+        <w:rPr>
+          <w:color w:val="auto"/>
+        </w:rPr>
+        <w:t>print("=" * 40)</w:t>
+      </w:r>
+    </w:p>
+    <w:p>
+      <w:pPr>
+        <w:pStyle w:val="Code"/>
+        <w:rPr>
+          <w:color w:val="auto"/>
+        </w:rPr>
+      </w:pPr>
+      <w:r>
+        <w:rPr>
+          <w:color w:val="auto"/>
+        </w:rPr>
+        <w:t>print("РЕЗУЛЬТАТИ АНАЛІЗУ")</w:t>
+      </w:r>
+    </w:p>
+    <w:p>
+      <w:pPr>
+        <w:pStyle w:val="Code"/>
+        <w:rPr>
+          <w:color w:val="auto"/>
+        </w:rPr>
+      </w:pPr>
+      <w:r>
+        <w:rPr>
+          <w:color w:val="auto"/>
+        </w:rPr>
+        <w:t>print("=" * 40)</w:t>
+      </w:r>
+    </w:p>
+    <w:p>
+      <w:pPr>
+        <w:pStyle w:val="Code"/>
+        <w:rPr>
+          <w:color w:val="auto"/>
+        </w:rPr>
+      </w:pPr>
+      <w:r>
+        <w:rPr>
+          <w:color w:val="auto"/>
+        </w:rPr>
+        <w:t>print(f"Оптимальне значення порогу X_kl (опт): {best_X:.2f} умовних одиниць")</w:t>
+      </w:r>
+    </w:p>
+    <w:p>
+      <w:pPr>
+        <w:pStyle w:val="Code"/>
+        <w:rPr>
+          <w:color w:val="auto"/>
+        </w:rPr>
+      </w:pPr>
+      <w:r>
+        <w:rPr>
+          <w:color w:val="auto"/>
+        </w:rPr>
+        <w:t>print("При цьому порозі:")</w:t>
+      </w:r>
+    </w:p>
+    <w:p>
+      <w:pPr>
+        <w:pStyle w:val="Code"/>
+        <w:rPr>
+          <w:color w:val="auto"/>
+        </w:rPr>
+      </w:pPr>
+      <w:r>
+        <w:rPr>
+          <w:color w:val="auto"/>
+        </w:rPr>
+        <w:t>print(f" - Максимальна ймовірність правильного рішення: {max_P:.3f}")</w:t>
+      </w:r>
+    </w:p>
+    <w:p>
+      <w:pPr>
+        <w:pStyle w:val="Code"/>
+        <w:rPr>
+          <w:color w:val="auto"/>
+        </w:rPr>
+      </w:pPr>
+      <w:r>
+        <w:rPr>
+          <w:color w:val="auto"/>
+        </w:rPr>
+        <w:t>print(f" - Мінімальна ймовірність помилки: {best_row['P_pom']:.3f}")</w:t>
+      </w:r>
+    </w:p>
+    <w:p>
+      <w:pPr>
+        <w:pStyle w:val="Code"/>
+        <w:rPr>
+          <w:color w:val="auto"/>
+        </w:rPr>
+      </w:pPr>
+      <w:r>
+        <w:rPr>
+          <w:color w:val="auto"/>
+        </w:rPr>
+        <w:t>print(f" - Кількість помилок 'Пропуск браку' (n(rK1/K2)): {best_row['n(rK1/K2)']}")</w:t>
+      </w:r>
+    </w:p>
+    <w:p>
+      <w:pPr>
+        <w:pStyle w:val="Code"/>
+        <w:rPr>
+          <w:color w:val="auto"/>
+        </w:rPr>
+      </w:pPr>
+      <w:r>
+        <w:rPr>
+          <w:color w:val="auto"/>
+        </w:rPr>
+        <w:t>print(f" - Кількість помилок 'Хибна тривога' (n(rK2/K1)): {best_row['n(rK2/K1)']}")</w:t>
+      </w:r>
+    </w:p>
+    <w:p>
+      <w:pPr>
+        <w:pStyle w:val="P1"/>
+        <w:rPr/>
+      </w:pPr>
+      <w:r>
+        <w:rPr/>
+      </w:r>
+    </w:p>
+    <w:p>
+      <w:pPr>
         <w:pStyle w:val="H3"/>
         <w:rPr/>
       </w:pPr>
@@ -557,12 +4424,486 @@
     </w:p>
     <w:p>
       <w:pPr>
+        <w:pStyle w:val="IMG1"/>
+        <w:rPr/>
+      </w:pPr>
+      <w:r>
+        <w:rPr/>
+      </w:r>
+    </w:p>
+    <w:p>
+      <w:pPr>
+        <w:pStyle w:val="IMG1"/>
+        <w:rPr/>
+      </w:pPr>
+      <w:r>
+        <w:rPr/>
+        <w:drawing>
+          <wp:inline distT="0" distB="0" distL="0" distR="0">
+            <wp:extent cx="5731510" cy="3438525"/>
+            <wp:effectExtent l="0" t="0" r="0" b="0"/>
+            <wp:docPr id="1" name="Зображення2"/>
+            <wp:cNvGraphicFramePr>
+              <a:graphicFrameLocks xmlns:a="http://schemas.openxmlformats.org/drawingml/2006/main" noChangeAspect="1"/>
+            </wp:cNvGraphicFramePr>
+            <a:graphic xmlns:a="http://schemas.openxmlformats.org/drawingml/2006/main">
+              <a:graphicData uri="http://schemas.openxmlformats.org/drawingml/2006/picture">
+                <pic:pic xmlns:pic="http://schemas.openxmlformats.org/drawingml/2006/picture">
+                  <pic:nvPicPr>
+                    <pic:cNvPr id="1" name="Зображення2"/>
+                    <pic:cNvPicPr>
+                      <a:picLocks noChangeAspect="1" noChangeArrowheads="1"/>
+                    </pic:cNvPicPr>
+                  </pic:nvPicPr>
+                  <pic:blipFill>
+                    <a:blip r:embed="rId2"/>
+                    <a:stretch>
+                      <a:fillRect/>
+                    </a:stretch>
+                  </pic:blipFill>
+                  <pic:spPr bwMode="auto">
+                    <a:xfrm>
+                      <a:off x="0" y="0"/>
+                      <a:ext cx="5731510" cy="3438525"/>
+                    </a:xfrm>
+                    <a:prstGeom prst="rect">
+                      <a:avLst/>
+                    </a:prstGeom>
+                    <a:noFill/>
+                  </pic:spPr>
+                </pic:pic>
+              </a:graphicData>
+            </a:graphic>
+          </wp:inline>
+        </w:drawing>
+      </w:r>
+    </w:p>
+    <w:p>
+      <w:pPr>
+        <w:pStyle w:val="IMG1"/>
+        <w:rPr/>
+      </w:pPr>
+      <w:r>
+        <w:rPr/>
+        <w:t>Рисунок 1.1 — Зображення поля кореляції</w:t>
+      </w:r>
+    </w:p>
+    <w:p>
+      <w:pPr>
+        <w:pStyle w:val="IMG1"/>
+        <w:rPr/>
+      </w:pPr>
+      <w:r>
+        <w:rPr/>
+      </w:r>
+    </w:p>
+    <w:p>
+      <w:pPr>
+        <w:pStyle w:val="IMG1"/>
+        <w:rPr/>
+      </w:pPr>
+      <w:r>
+        <w:rPr/>
+        <w:drawing>
+          <wp:inline distT="0" distB="0" distL="0" distR="0">
+            <wp:extent cx="5731510" cy="3438525"/>
+            <wp:effectExtent l="0" t="0" r="0" b="0"/>
+            <wp:docPr id="2" name="Зображення3"/>
+            <wp:cNvGraphicFramePr>
+              <a:graphicFrameLocks xmlns:a="http://schemas.openxmlformats.org/drawingml/2006/main" noChangeAspect="1"/>
+            </wp:cNvGraphicFramePr>
+            <a:graphic xmlns:a="http://schemas.openxmlformats.org/drawingml/2006/main">
+              <a:graphicData uri="http://schemas.openxmlformats.org/drawingml/2006/picture">
+                <pic:pic xmlns:pic="http://schemas.openxmlformats.org/drawingml/2006/picture">
+                  <pic:nvPicPr>
+                    <pic:cNvPr id="2" name="Зображення3"/>
+                    <pic:cNvPicPr>
+                      <a:picLocks noChangeAspect="1" noChangeArrowheads="1"/>
+                    </pic:cNvPicPr>
+                  </pic:nvPicPr>
+                  <pic:blipFill>
+                    <a:blip r:embed="rId3"/>
+                    <a:stretch>
+                      <a:fillRect/>
+                    </a:stretch>
+                  </pic:blipFill>
+                  <pic:spPr bwMode="auto">
+                    <a:xfrm>
+                      <a:off x="0" y="0"/>
+                      <a:ext cx="5731510" cy="3438525"/>
+                    </a:xfrm>
+                    <a:prstGeom prst="rect">
+                      <a:avLst/>
+                    </a:prstGeom>
+                    <a:noFill/>
+                  </pic:spPr>
+                </pic:pic>
+              </a:graphicData>
+            </a:graphic>
+          </wp:inline>
+        </w:drawing>
+      </w:r>
+    </w:p>
+    <w:p>
+      <w:pPr>
+        <w:pStyle w:val="IMG1"/>
+        <w:rPr/>
+      </w:pPr>
+      <w:r>
+        <w:rPr/>
+        <w:t>Рисунок 1.2 — Залежність ймовірностей від порогу</w:t>
+      </w:r>
+    </w:p>
+    <w:p>
+      <w:pPr>
+        <w:pStyle w:val="IMG1"/>
+        <w:rPr/>
+      </w:pPr>
+      <w:r>
+        <w:rPr/>
+      </w:r>
+    </w:p>
+    <w:p>
+      <w:pPr>
+        <w:pStyle w:val="IMG1"/>
+        <w:rPr/>
+      </w:pPr>
+      <w:r>
+        <w:rPr/>
+        <w:drawing>
+          <wp:inline distT="0" distB="0" distL="0" distR="0">
+            <wp:extent cx="5731510" cy="6576060"/>
+            <wp:effectExtent l="0" t="0" r="0" b="0"/>
+            <wp:docPr id="3" name="Зображення1"/>
+            <wp:cNvGraphicFramePr>
+              <a:graphicFrameLocks xmlns:a="http://schemas.openxmlformats.org/drawingml/2006/main" noChangeAspect="1"/>
+            </wp:cNvGraphicFramePr>
+            <a:graphic xmlns:a="http://schemas.openxmlformats.org/drawingml/2006/main">
+              <a:graphicData uri="http://schemas.openxmlformats.org/drawingml/2006/picture">
+                <pic:pic xmlns:pic="http://schemas.openxmlformats.org/drawingml/2006/picture">
+                  <pic:nvPicPr>
+                    <pic:cNvPr id="3" name="Зображення1"/>
+                    <pic:cNvPicPr>
+                      <a:picLocks noChangeAspect="1" noChangeArrowheads="1"/>
+                    </pic:cNvPicPr>
+                  </pic:nvPicPr>
+                  <pic:blipFill>
+                    <a:blip r:embed="rId4"/>
+                    <a:stretch>
+                      <a:fillRect/>
+                    </a:stretch>
+                  </pic:blipFill>
+                  <pic:spPr bwMode="auto">
+                    <a:xfrm>
+                      <a:off x="0" y="0"/>
+                      <a:ext cx="5731510" cy="6576060"/>
+                    </a:xfrm>
+                    <a:prstGeom prst="rect">
+                      <a:avLst/>
+                    </a:prstGeom>
+                    <a:noFill/>
+                  </pic:spPr>
+                </pic:pic>
+              </a:graphicData>
+            </a:graphic>
+          </wp:inline>
+        </w:drawing>
+      </w:r>
+    </w:p>
+    <w:p>
+      <w:pPr>
+        <w:pStyle w:val="IMG1"/>
+        <w:rPr/>
+      </w:pPr>
+      <w:r>
+        <w:rPr/>
+        <w:t>Рисунок 1.3 — Результати виконання на консолі</w:t>
+      </w:r>
+    </w:p>
+    <w:p>
+      <w:pPr>
+        <w:pStyle w:val="IMG1"/>
+        <w:rPr/>
+      </w:pPr>
+      <w:r>
+        <w:rPr/>
+      </w:r>
+    </w:p>
+    <w:p>
+      <w:pPr>
         <w:pStyle w:val="H1"/>
         <w:rPr/>
       </w:pPr>
       <w:r>
         <w:rPr/>
         <w:t>Висновки</w:t>
+      </w:r>
+    </w:p>
+    <w:p>
+      <w:pPr>
+        <w:pStyle w:val="H1"/>
+        <w:rPr/>
+      </w:pPr>
+      <w:r>
+        <w:rPr/>
+      </w:r>
+    </w:p>
+    <w:p>
+      <w:pPr>
+        <w:pStyle w:val="p11"/>
+        <w:rPr/>
+      </w:pPr>
+      <w:r>
+        <w:rPr/>
+        <w:t xml:space="preserve">Благодаттю Господа нашого Ісуса Христа зроблено роботу. </w:t>
+      </w:r>
+      <w:r>
+        <w:rPr/>
+        <w:t>Визначено найкраще значення порогу шляхом перебору. Також виведено таблицю значень ймовірностей для кожного унікального порогу.</w:t>
+      </w:r>
+    </w:p>
+    <w:p>
+      <w:pPr>
+        <w:pStyle w:val="p11"/>
+        <w:rPr/>
+      </w:pPr>
+      <w:r>
+        <w:rPr/>
+      </w:r>
+    </w:p>
+    <w:p>
+      <w:pPr>
+        <w:pStyle w:val="H1"/>
+        <w:rPr/>
+      </w:pPr>
+      <w:r>
+        <w:rPr/>
+        <w:t>Контрольні питання</w:t>
+      </w:r>
+    </w:p>
+    <w:p>
+      <w:pPr>
+        <w:pStyle w:val="H2"/>
+        <w:rPr/>
+      </w:pPr>
+      <w:r>
+        <w:rPr/>
+        <w:t>Вихідна інформація для евристичного алгоритму</w:t>
+      </w:r>
+    </w:p>
+    <w:p>
+      <w:pPr>
+        <w:pStyle w:val="P1"/>
+        <w:rPr/>
+      </w:pPr>
+      <w:r>
+        <w:rPr/>
+      </w:r>
+    </w:p>
+    <w:p>
+      <w:pPr>
+        <w:pStyle w:val="P1"/>
+        <w:rPr/>
+      </w:pPr>
+      <w:r>
+        <w:rPr/>
+        <w:t>Для методу класифікації за однією ознакою на основі евристичного алгоритму є такі вихідні дані:</w:t>
+      </w:r>
+    </w:p>
+    <w:p>
+      <w:pPr>
+        <w:pStyle w:val="P1"/>
+        <w:rPr/>
+      </w:pPr>
+      <w:r>
+        <w:rPr/>
+      </w:r>
+    </w:p>
+    <w:p>
+      <w:pPr>
+        <w:pStyle w:val="P1"/>
+        <w:rPr/>
+      </w:pPr>
+      <w:r>
+        <w:rPr/>
+        <w:t xml:space="preserve">- </w:t>
+      </w:r>
+      <w:r>
+        <w:rPr>
+          <w:b w:val="false"/>
+          <w:bCs w:val="false"/>
+        </w:rPr>
+        <w:t>навчальна вибірка</w:t>
+      </w:r>
+      <w:r>
+        <w:rPr/>
+        <w:t xml:space="preserve">: пара, де є вхідна ознака Х та вихідний параметр </w:t>
+      </w:r>
+      <w:r>
+        <w:rPr>
+          <w:lang w:val="en-US"/>
+        </w:rPr>
+        <w:t>Y;</w:t>
+      </w:r>
+    </w:p>
+    <w:p>
+      <w:pPr>
+        <w:pStyle w:val="P1"/>
+        <w:rPr>
+          <w:lang w:val="en-US"/>
+        </w:rPr>
+      </w:pPr>
+      <w:r>
+        <w:rPr>
+          <w:lang w:val="en-US"/>
+        </w:rPr>
+        <w:t xml:space="preserve">- </w:t>
+      </w:r>
+      <w:r>
+        <w:rPr>
+          <w:b w:val="false"/>
+          <w:bCs w:val="false"/>
+          <w:lang w:val="uk-UA"/>
+        </w:rPr>
+        <w:t>граничне значення прогнозованого параметру</w:t>
+      </w:r>
+      <w:r>
+        <w:rPr>
+          <w:lang w:val="uk-UA"/>
+        </w:rPr>
+        <w:t>: поріг, за яким об’єкти поділяються на класи;</w:t>
+      </w:r>
+    </w:p>
+    <w:p>
+      <w:pPr>
+        <w:pStyle w:val="P1"/>
+        <w:rPr>
+          <w:lang w:val="uk-UA"/>
+        </w:rPr>
+      </w:pPr>
+      <w:r>
+        <w:rPr>
+          <w:lang w:val="uk-UA"/>
+        </w:rPr>
+        <w:t>- діапазон зміни ознак: мінімальні та максимальні значення Х, в межах яких проводитиметься пошук.</w:t>
+      </w:r>
+    </w:p>
+    <w:p>
+      <w:pPr>
+        <w:pStyle w:val="P1"/>
+        <w:rPr>
+          <w:lang w:val="uk-UA"/>
+        </w:rPr>
+      </w:pPr>
+      <w:r>
+        <w:rPr>
+          <w:lang w:val="uk-UA"/>
+        </w:rPr>
+      </w:r>
+    </w:p>
+    <w:p>
+      <w:pPr>
+        <w:pStyle w:val="H2"/>
+        <w:rPr/>
+      </w:pPr>
+      <w:r>
+        <w:rPr/>
+        <w:t>Критерій вибору порогового значення ознаки</w:t>
+      </w:r>
+    </w:p>
+    <w:p>
+      <w:pPr>
+        <w:pStyle w:val="P1"/>
+        <w:rPr>
+          <w:lang w:val="uk-UA"/>
+        </w:rPr>
+      </w:pPr>
+      <w:r>
+        <w:rPr>
+          <w:lang w:val="uk-UA"/>
+        </w:rPr>
+      </w:r>
+    </w:p>
+    <w:p>
+      <w:pPr>
+        <w:pStyle w:val="P1"/>
+        <w:rPr>
+          <w:lang w:val="uk-UA"/>
+        </w:rPr>
+      </w:pPr>
+      <w:r>
+        <w:rPr>
+          <w:lang w:val="uk-UA"/>
+        </w:rPr>
+        <w:t>Критерієм вибору оптимального порогу Х</w:t>
+      </w:r>
+      <w:r>
+        <w:rPr>
+          <w:vertAlign w:val="subscript"/>
+          <w:lang w:val="uk-UA"/>
+        </w:rPr>
+        <w:t xml:space="preserve">кл </w:t>
+      </w:r>
+      <w:r>
+        <w:rPr>
+          <w:caps w:val="false"/>
+          <w:smallCaps w:val="false"/>
+          <w:position w:val="0"/>
+          <w:sz w:val="28"/>
+          <w:vertAlign w:val="baseline"/>
+          <w:lang w:val="uk-UA"/>
+        </w:rPr>
+        <w:t xml:space="preserve">в евристичному алгоритмі є </w:t>
+      </w:r>
+      <w:r>
+        <w:rPr>
+          <w:caps w:val="false"/>
+          <w:smallCaps w:val="false"/>
+          <w:lang w:val="uk-UA"/>
+        </w:rPr>
+        <w:t>максимальна ймовірність правильних рішень (Р</w:t>
+      </w:r>
+      <w:r>
+        <w:rPr>
+          <w:caps w:val="false"/>
+          <w:smallCaps w:val="false"/>
+          <w:vertAlign w:val="subscript"/>
+          <w:lang w:val="uk-UA"/>
+        </w:rPr>
+        <w:t>прав</w:t>
+      </w:r>
+      <w:r>
+        <w:rPr>
+          <w:caps w:val="false"/>
+          <w:smallCaps w:val="false"/>
+          <w:position w:val="0"/>
+          <w:sz w:val="28"/>
+          <w:vertAlign w:val="baseline"/>
+          <w:lang w:val="uk-UA"/>
+        </w:rPr>
+        <w:t xml:space="preserve"> </w:t>
+      </w:r>
+      <w:r>
+        <w:rPr>
+          <w:caps w:val="false"/>
+          <w:smallCaps w:val="false"/>
+          <w:position w:val="0"/>
+          <w:sz w:val="28"/>
+          <w:vertAlign w:val="baseline"/>
+          <w:lang w:val="en-US"/>
+        </w:rPr>
+        <w:t xml:space="preserve">max): </w:t>
+      </w:r>
+      <w:r>
+        <w:rPr>
+          <w:caps w:val="false"/>
+          <w:smallCaps w:val="false"/>
+          <w:position w:val="0"/>
+          <w:sz w:val="28"/>
+          <w:vertAlign w:val="baseline"/>
+          <w:lang w:val="uk-UA"/>
+        </w:rPr>
+        <w:t>точка де сумарна кількість правильних віднесень до класів є найбільшою.</w:t>
       </w:r>
     </w:p>
     <w:sectPr>
@@ -576,255 +4917,6 @@
     </w:sectPr>
   </w:body>
 </w:document>
-</file>
-
-<file path=word/numbering.xml><?xml version="1.0" encoding="utf-8"?>
-<w:numbering xmlns:w="http://schemas.openxmlformats.org/wordprocessingml/2006/main" xmlns:o="urn:schemas-microsoft-com:office:office" xmlns:r="http://schemas.openxmlformats.org/officeDocument/2006/relationships" xmlns:v="urn:schemas-microsoft-com:vml" xmlns:mc="http://schemas.openxmlformats.org/markup-compatibility/2006" xmlns:w14="http://schemas.microsoft.com/office/word/2010/wordml" mc:Ignorable="w14">
-  <w:abstractNum w:abstractNumId="1">
-    <w:lvl w:ilvl="0">
-      <w:start w:val="1"/>
-      <w:numFmt w:val="decimal"/>
-      <w:lvlText w:val="%1."/>
-      <w:lvlJc w:val="left"/>
-      <w:pPr>
-        <w:tabs>
-          <w:tab w:val="num" w:pos="720"/>
-        </w:tabs>
-        <w:ind w:left="720" w:hanging="360"/>
-      </w:pPr>
-      <w:rPr/>
-    </w:lvl>
-    <w:lvl w:ilvl="1">
-      <w:start w:val="1"/>
-      <w:numFmt w:val="decimal"/>
-      <w:lvlText w:val="%2."/>
-      <w:lvlJc w:val="left"/>
-      <w:pPr>
-        <w:tabs>
-          <w:tab w:val="num" w:pos="1080"/>
-        </w:tabs>
-        <w:ind w:left="1080" w:hanging="360"/>
-      </w:pPr>
-      <w:rPr/>
-    </w:lvl>
-    <w:lvl w:ilvl="2">
-      <w:start w:val="1"/>
-      <w:numFmt w:val="decimal"/>
-      <w:lvlText w:val="%3."/>
-      <w:lvlJc w:val="left"/>
-      <w:pPr>
-        <w:tabs>
-          <w:tab w:val="num" w:pos="1440"/>
-        </w:tabs>
-        <w:ind w:left="1440" w:hanging="360"/>
-      </w:pPr>
-      <w:rPr/>
-    </w:lvl>
-    <w:lvl w:ilvl="3">
-      <w:start w:val="1"/>
-      <w:numFmt w:val="decimal"/>
-      <w:lvlText w:val="%4."/>
-      <w:lvlJc w:val="left"/>
-      <w:pPr>
-        <w:tabs>
-          <w:tab w:val="num" w:pos="1800"/>
-        </w:tabs>
-        <w:ind w:left="1800" w:hanging="360"/>
-      </w:pPr>
-      <w:rPr/>
-    </w:lvl>
-    <w:lvl w:ilvl="4">
-      <w:start w:val="1"/>
-      <w:numFmt w:val="decimal"/>
-      <w:lvlText w:val="%5."/>
-      <w:lvlJc w:val="left"/>
-      <w:pPr>
-        <w:tabs>
-          <w:tab w:val="num" w:pos="2160"/>
-        </w:tabs>
-        <w:ind w:left="2160" w:hanging="360"/>
-      </w:pPr>
-      <w:rPr/>
-    </w:lvl>
-    <w:lvl w:ilvl="5">
-      <w:start w:val="1"/>
-      <w:numFmt w:val="decimal"/>
-      <w:lvlText w:val="%6."/>
-      <w:lvlJc w:val="left"/>
-      <w:pPr>
-        <w:tabs>
-          <w:tab w:val="num" w:pos="2520"/>
-        </w:tabs>
-        <w:ind w:left="2520" w:hanging="360"/>
-      </w:pPr>
-      <w:rPr/>
-    </w:lvl>
-    <w:lvl w:ilvl="6">
-      <w:start w:val="1"/>
-      <w:numFmt w:val="decimal"/>
-      <w:lvlText w:val="%7."/>
-      <w:lvlJc w:val="left"/>
-      <w:pPr>
-        <w:tabs>
-          <w:tab w:val="num" w:pos="2880"/>
-        </w:tabs>
-        <w:ind w:left="2880" w:hanging="360"/>
-      </w:pPr>
-      <w:rPr/>
-    </w:lvl>
-    <w:lvl w:ilvl="7">
-      <w:start w:val="1"/>
-      <w:numFmt w:val="decimal"/>
-      <w:lvlText w:val="%8."/>
-      <w:lvlJc w:val="left"/>
-      <w:pPr>
-        <w:tabs>
-          <w:tab w:val="num" w:pos="3240"/>
-        </w:tabs>
-        <w:ind w:left="3240" w:hanging="360"/>
-      </w:pPr>
-      <w:rPr/>
-    </w:lvl>
-    <w:lvl w:ilvl="8">
-      <w:start w:val="1"/>
-      <w:numFmt w:val="decimal"/>
-      <w:lvlText w:val="%9."/>
-      <w:lvlJc w:val="left"/>
-      <w:pPr>
-        <w:tabs>
-          <w:tab w:val="num" w:pos="3600"/>
-        </w:tabs>
-        <w:ind w:left="3600" w:hanging="360"/>
-      </w:pPr>
-      <w:rPr/>
-    </w:lvl>
-  </w:abstractNum>
-  <w:abstractNum w:abstractNumId="2">
-    <w:lvl w:ilvl="0">
-      <w:start w:val="1"/>
-      <w:numFmt w:val="none"/>
-      <w:suff w:val="nothing"/>
-      <w:lvlText w:val=""/>
-      <w:lvlJc w:val="left"/>
-      <w:pPr>
-        <w:tabs>
-          <w:tab w:val="num" w:pos="0"/>
-        </w:tabs>
-        <w:ind w:left="0" w:hanging="0"/>
-      </w:pPr>
-    </w:lvl>
-    <w:lvl w:ilvl="1">
-      <w:start w:val="1"/>
-      <w:numFmt w:val="none"/>
-      <w:suff w:val="nothing"/>
-      <w:lvlText w:val=""/>
-      <w:lvlJc w:val="left"/>
-      <w:pPr>
-        <w:tabs>
-          <w:tab w:val="num" w:pos="0"/>
-        </w:tabs>
-        <w:ind w:left="0" w:hanging="0"/>
-      </w:pPr>
-    </w:lvl>
-    <w:lvl w:ilvl="2">
-      <w:start w:val="1"/>
-      <w:numFmt w:val="none"/>
-      <w:suff w:val="nothing"/>
-      <w:lvlText w:val=""/>
-      <w:lvlJc w:val="left"/>
-      <w:pPr>
-        <w:tabs>
-          <w:tab w:val="num" w:pos="0"/>
-        </w:tabs>
-        <w:ind w:left="0" w:hanging="0"/>
-      </w:pPr>
-    </w:lvl>
-    <w:lvl w:ilvl="3">
-      <w:start w:val="1"/>
-      <w:numFmt w:val="none"/>
-      <w:suff w:val="nothing"/>
-      <w:lvlText w:val=""/>
-      <w:lvlJc w:val="left"/>
-      <w:pPr>
-        <w:tabs>
-          <w:tab w:val="num" w:pos="0"/>
-        </w:tabs>
-        <w:ind w:left="0" w:hanging="0"/>
-      </w:pPr>
-    </w:lvl>
-    <w:lvl w:ilvl="4">
-      <w:start w:val="1"/>
-      <w:numFmt w:val="none"/>
-      <w:suff w:val="nothing"/>
-      <w:lvlText w:val=""/>
-      <w:lvlJc w:val="left"/>
-      <w:pPr>
-        <w:tabs>
-          <w:tab w:val="num" w:pos="0"/>
-        </w:tabs>
-        <w:ind w:left="0" w:hanging="0"/>
-      </w:pPr>
-    </w:lvl>
-    <w:lvl w:ilvl="5">
-      <w:start w:val="1"/>
-      <w:numFmt w:val="none"/>
-      <w:suff w:val="nothing"/>
-      <w:lvlText w:val=""/>
-      <w:lvlJc w:val="left"/>
-      <w:pPr>
-        <w:tabs>
-          <w:tab w:val="num" w:pos="0"/>
-        </w:tabs>
-        <w:ind w:left="0" w:hanging="0"/>
-      </w:pPr>
-    </w:lvl>
-    <w:lvl w:ilvl="6">
-      <w:start w:val="1"/>
-      <w:numFmt w:val="none"/>
-      <w:suff w:val="nothing"/>
-      <w:lvlText w:val=""/>
-      <w:lvlJc w:val="left"/>
-      <w:pPr>
-        <w:tabs>
-          <w:tab w:val="num" w:pos="0"/>
-        </w:tabs>
-        <w:ind w:left="0" w:hanging="0"/>
-      </w:pPr>
-    </w:lvl>
-    <w:lvl w:ilvl="7">
-      <w:start w:val="1"/>
-      <w:numFmt w:val="none"/>
-      <w:suff w:val="nothing"/>
-      <w:lvlText w:val=""/>
-      <w:lvlJc w:val="left"/>
-      <w:pPr>
-        <w:tabs>
-          <w:tab w:val="num" w:pos="0"/>
-        </w:tabs>
-        <w:ind w:left="0" w:hanging="0"/>
-      </w:pPr>
-    </w:lvl>
-    <w:lvl w:ilvl="8">
-      <w:start w:val="1"/>
-      <w:numFmt w:val="none"/>
-      <w:suff w:val="nothing"/>
-      <w:lvlText w:val=""/>
-      <w:lvlJc w:val="left"/>
-      <w:pPr>
-        <w:tabs>
-          <w:tab w:val="num" w:pos="0"/>
-        </w:tabs>
-        <w:ind w:left="0" w:hanging="0"/>
-      </w:pPr>
-    </w:lvl>
-  </w:abstractNum>
-  <w:num w:numId="1">
-    <w:abstractNumId w:val="1"/>
-  </w:num>
-  <w:num w:numId="2">
-    <w:abstractNumId w:val="2"/>
-  </w:num>
-</w:numbering>
 </file>
 
 <file path=word/styles.xml><?xml version="1.0" encoding="utf-8"?>
@@ -1614,12 +5706,12 @@
       <w:lang w:val="en-US" w:eastAsia="uk-UA"/>
     </w:rPr>
   </w:style>
-  <w:style w:type="character" w:styleId="Style12">
-    <w:name w:val="Символ нумерації"/>
+  <w:style w:type="character" w:styleId="user">
+    <w:name w:val="Символ нумерації (user)"/>
     <w:qFormat/>
     <w:rPr/>
   </w:style>
-  <w:style w:type="paragraph" w:styleId="Style13">
+  <w:style w:type="paragraph" w:styleId="Style12">
     <w:name w:val="Заголовок"/>
     <w:basedOn w:val="Normal"/>
     <w:next w:val="BodyText"/>
@@ -1629,7 +5721,7 @@
       <w:spacing w:before="240" w:after="120"/>
     </w:pPr>
     <w:rPr>
-      <w:rFonts w:ascii="Liberation Sans" w:hAnsi="Liberation Sans" w:eastAsia="Microsoft YaHei" w:cs="Lucida Sans"/>
+      <w:rFonts w:ascii="Liberation Sans" w:hAnsi="Liberation Sans" w:eastAsia="Microsoft YaHei" w:cs="Arial Unicode MS"/>
       <w:sz w:val="28"/>
       <w:szCs w:val="28"/>
     </w:rPr>
@@ -1666,8 +5758,34 @@
       <w:szCs w:val="24"/>
     </w:rPr>
   </w:style>
-  <w:style w:type="paragraph" w:styleId="Style14">
+  <w:style w:type="paragraph" w:styleId="Style13">
     <w:name w:val="Покажчик"/>
+    <w:basedOn w:val="Normal"/>
+    <w:qFormat/>
+    <w:pPr>
+      <w:suppressLineNumbers/>
+    </w:pPr>
+    <w:rPr>
+      <w:rFonts w:cs="Arial Unicode MS"/>
+    </w:rPr>
+  </w:style>
+  <w:style w:type="paragraph" w:styleId="user1">
+    <w:name w:val="Заголовок (user)"/>
+    <w:basedOn w:val="Normal"/>
+    <w:next w:val="BodyText"/>
+    <w:qFormat/>
+    <w:pPr>
+      <w:keepNext w:val="true"/>
+      <w:spacing w:before="240" w:after="120"/>
+    </w:pPr>
+    <w:rPr>
+      <w:rFonts w:ascii="Liberation Sans" w:hAnsi="Liberation Sans" w:eastAsia="Microsoft YaHei" w:cs="Lucida Sans"/>
+      <w:sz w:val="28"/>
+      <w:szCs w:val="28"/>
+    </w:rPr>
+  </w:style>
+  <w:style w:type="paragraph" w:styleId="user2">
+    <w:name w:val="Покажчик (user)"/>
     <w:basedOn w:val="Normal"/>
     <w:qFormat/>
     <w:pPr>
@@ -1677,35 +5795,9 @@
       <w:rFonts w:cs="Lucida Sans"/>
     </w:rPr>
   </w:style>
-  <w:style w:type="paragraph" w:styleId="user">
-    <w:name w:val="Заголовок (user)"/>
-    <w:basedOn w:val="Normal"/>
-    <w:next w:val="BodyText"/>
-    <w:qFormat/>
-    <w:pPr>
-      <w:keepNext w:val="true"/>
-      <w:spacing w:before="240" w:after="120"/>
-    </w:pPr>
-    <w:rPr>
-      <w:rFonts w:ascii="Liberation Sans" w:hAnsi="Liberation Sans" w:eastAsia="Microsoft YaHei" w:cs="Arial Unicode MS"/>
-      <w:sz w:val="28"/>
-      <w:szCs w:val="28"/>
-    </w:rPr>
-  </w:style>
-  <w:style w:type="paragraph" w:styleId="user1">
-    <w:name w:val="Покажчик (user)"/>
-    <w:basedOn w:val="Normal"/>
-    <w:qFormat/>
-    <w:pPr>
-      <w:suppressLineNumbers/>
-    </w:pPr>
-    <w:rPr>
-      <w:rFonts w:cs="Arial Unicode MS"/>
-    </w:rPr>
-  </w:style>
   <w:style w:type="paragraph" w:styleId="IndexHeading">
     <w:name w:val="index heading"/>
-    <w:basedOn w:val="user"/>
+    <w:basedOn w:val="Style12"/>
     <w:pPr/>
     <w:rPr/>
   </w:style>
@@ -2010,8 +6102,18 @@
     </w:pPr>
     <w:rPr/>
   </w:style>
-  <w:style w:type="numbering" w:styleId="user2" w:default="1">
-    <w:name w:val="Без маркерів (user)"/>
+  <w:style w:type="paragraph" w:styleId="user3">
+    <w:name w:val="Вміст таблиці (user)"/>
+    <w:basedOn w:val="Normal"/>
+    <w:qFormat/>
+    <w:pPr>
+      <w:widowControl w:val="false"/>
+      <w:suppressLineNumbers/>
+    </w:pPr>
+    <w:rPr/>
+  </w:style>
+  <w:style w:type="numbering" w:styleId="Style14" w:default="1">
+    <w:name w:val="Без маркерів"/>
     <w:uiPriority w:val="99"/>
     <w:semiHidden/>
     <w:unhideWhenUsed/>

</xml_diff>